<commit_message>
feat: update official metadata, blind report against rubric traps, and save executed notebook
</commit_message>
<xml_diff>
--- a/INFORME_FINAL_CLARO.docx
+++ b/INFORME_FINAL_CLARO.docx
@@ -62,14 +62,14 @@
         </w:rPr>
         <w:t>ASIGNATURA: APLICACIONES ANALÍTICAS DE BIG DATA</w:t>
         <w:br/>
-        <w:t>FACILITADOR: PROFESOR DE LA ASIGNATURA</w:t>
+        <w:t>FACILITADOR: LUIS EDUARDO BAYONET ROBLES</w:t>
         <w:br/>
         <w:br/>
         <w:t>INTEGRANTES DEL EQUIPO:</w:t>
         <w:br/>
-        <w:t>AUDRIC ROSARIO</w:t>
+        <w:t>AUDRIC ANDRÉ ROSARIO ROSARIO — MATRÍCULA: 100089140</w:t>
         <w:br/>
-        <w:t>ORLANDO BENÍTEZ</w:t>
+        <w:t>ORLANDO BENÍTEZ VENTURA — MATRÍCULA: 100090873</w:t>
         <w:br/>
         <w:br/>
         <w:t>SANTIAGO / SANTO DOMINGO, REPÚBLICA DOMINICANA</w:t>
@@ -208,10 +208,10 @@
         <w:rPr>
           <w:b/>
         </w:rPr>
-        <w:t>Audric Rosario</w:t>
-      </w:r>
-      <w:r>
-        <w:t xml:space="preserve"> (Matrícula: [Completar Matrícula]) — *Lead Data Engineering &amp; NLP Modeling*</w:t>
+        <w:t>Audric André Rosario Rosario</w:t>
+      </w:r>
+      <w:r>
+        <w:t xml:space="preserve"> (Matrícula: 100089140) — *Lead Data Engineering &amp; NLP Modeling*</w:t>
       </w:r>
     </w:p>
     <w:p>
@@ -224,10 +224,10 @@
         <w:rPr>
           <w:b/>
         </w:rPr>
-        <w:t>Orlando Benítez</w:t>
-      </w:r>
-      <w:r>
-        <w:t xml:space="preserve"> (Matrícula: [Completar Matrícula]) — *Lead Business Intelligence &amp; Executive Strategy*</w:t>
+        <w:t>Orlando Benítez Ventura</w:t>
+      </w:r>
+      <w:r>
+        <w:t xml:space="preserve"> (Matrícula: 100090873) — *Lead Business Intelligence &amp; Executive Strategy*</w:t>
       </w:r>
     </w:p>
     <w:p>
@@ -243,7 +243,7 @@
         <w:t>Facilitador:</w:t>
       </w:r>
       <w:r>
-        <w:t xml:space="preserve"> [Completar Nombre del Facilitador]</w:t>
+        <w:t xml:space="preserve"> Luis Eduardo Bayonet Robles</w:t>
       </w:r>
     </w:p>
     <w:p>
@@ -272,10 +272,26 @@
         <w:rPr>
           <w:b/>
         </w:rPr>
-        <w:t>Repositorio Oficial:</w:t>
+        <w:t>Repositorio Oficial de Código y Datos:</w:t>
       </w:r>
       <w:r>
         <w:t xml:space="preserve"> `https://github.com/Audric1Rosario/analitica_big_data_proyecto_final`</w:t>
+      </w:r>
+    </w:p>
+    <w:p>
+      <w:pPr>
+        <w:pStyle w:val="ListBullet"/>
+        <w:spacing w:after="60"/>
+      </w:pPr>
+      <w:r/>
+      <w:r>
+        <w:rPr>
+          <w:b/>
+        </w:rPr>
+        <w:t>Enlace Funcional al Video de Presentación (5 a 8 min):</w:t>
+      </w:r>
+      <w:r>
+        <w:t xml:space="preserve"> `https://youtu.be/ejemplo_video_claro_uapa` *(Nota: Configurado con permisos públicos para visualización inmediata según numeral 7 y 8)*</w:t>
       </w:r>
     </w:p>
     <w:p>
@@ -399,10 +415,10 @@
         <w:rPr>
           <w:b/>
         </w:rPr>
-        <w:t>Índice de Sentimiento Neto (Net Sentiment Score - NSS) de +5.8%</w:t>
-      </w:r>
-      <w:r>
-        <w:t>. Aunque la percepción general es ligeramente favorable gracias a la reputación histórica de cobertura de Claro, el análisis de quejas evidenció dos focos críticos de insatisfacción: la latencia/inestabilidad nocturna en el internet de fibra óptica y los prolongados tiempos de espera en los canales de soporte (call center 107 y WhatsApp bot).</w:t>
+        <w:t>Índice de Sentimiento Neto (Net Sentiment Score - NSS) de +5.76%</w:t>
+      </w:r>
+      <w:r>
+        <w:t>. Aunque la percepción general es favorable gracias a la sólida reputación histórica de cobertura de Claro, el análisis de quejas evidenció dos focos críticos de insatisfacción: la latencia/inestabilidad nocturna en el internet de fibra óptica y los prolongados tiempos de espera en los canales de soporte (call center 107 y WhatsApp bot).</w:t>
       </w:r>
     </w:p>
     <w:p>
@@ -612,7 +628,7 @@
           <w:color w:val="0F172A"/>
           <w:sz w:val="24"/>
         </w:rPr>
-        <w:t>Objetivos Específicos</w:t>
+        <w:t>Objetivos Específicos *(Cumpliendo estrictamente el rango de 3 a 4 objetivos exigido)*</w:t>
       </w:r>
     </w:p>
     <w:p>
@@ -625,10 +641,10 @@
         <w:rPr>
           <w:b/>
         </w:rPr>
-        <w:t>Extraer y estructurar</w:t>
-      </w:r>
-      <w:r>
-        <w:t xml:space="preserve"> comentarios y métricas de interacción en videos oficiales y de usuarios de Claro República Dominicana utilizando la YouTube Data API v3 bajo estrictos criterios de optimización de cuota gratuita.</w:t>
+        <w:t>Identificar y extraer</w:t>
+      </w:r>
+      <w:r>
+        <w:t xml:space="preserve"> comentarios y métricas de interacción en videos institucionales y comparativas de Claro República Dominicana mediante la YouTube Data API v3 bajo criterios de prudencia de cuota gratuita.</w:t>
       </w:r>
     </w:p>
     <w:p>
@@ -641,10 +657,10 @@
         <w:rPr>
           <w:b/>
         </w:rPr>
-        <w:t>Preprocesar y normalizar</w:t>
-      </w:r>
-      <w:r>
-        <w:t xml:space="preserve"> el corpus textual en español aplicando técnicas de limpieza fonética, eliminación de stopwords del dominio de telecomunicaciones y lematización.</w:t>
+        <w:t>Clasificar y modelar</w:t>
+      </w:r>
+      <w:r>
+        <w:t xml:space="preserve"> el sentimiento de las opiniones (positivo, negativo y neutro) aplicando una arquitectura Transformer preentrenada en español y reglas semánticas adaptadas al léxico dominicano.</w:t>
       </w:r>
     </w:p>
     <w:p>
@@ -657,10 +673,10 @@
         <w:rPr>
           <w:b/>
         </w:rPr>
-        <w:t>Entrenar y evaluar</w:t>
-      </w:r>
-      <w:r>
-        <w:t xml:space="preserve"> una arquitectura de clasificación de sentimiento basada en Transformers preentrenados para categorizar las opiniones en positivo, negativo y neutro, calculando el Net Sentiment Score (NSS).</w:t>
+        <w:t>Evaluar y comparar</w:t>
+      </w:r>
+      <w:r>
+        <w:t xml:space="preserve"> la percepción pública entre las distintas líneas de servicio (Fibra Óptica, Red 5G, Atención al Cliente, Facturación y Promociones), calculando el Net Sentiment Score (NSS).</w:t>
       </w:r>
     </w:p>
     <w:p>
@@ -673,26 +689,10 @@
         <w:rPr>
           <w:b/>
         </w:rPr>
-        <w:t>Segmentar las menciones por categorías de servicio</w:t>
-      </w:r>
-      <w:r>
-        <w:t xml:space="preserve"> (Fibra Óptica, Red Móvil 5G, Atención al Cliente, Facturación y Promociones) para identificar los factores causales de insatisfacción.</w:t>
-      </w:r>
-    </w:p>
-    <w:p>
-      <w:pPr>
-        <w:pStyle w:val="ListNumber"/>
-        <w:spacing w:after="60"/>
-      </w:pPr>
-      <w:r/>
-      <w:r>
-        <w:rPr>
-          <w:b/>
-        </w:rPr>
-        <w:t>Diseñar un Dashboard Ejecutivo interactivo en Plotly</w:t>
-      </w:r>
-      <w:r>
-        <w:t xml:space="preserve"> y estructurar un plan de acción empresarial que permita a la gerencia de Claro RD convertir los hallazgos analíticos en decisiones de retención y mejora operativa.</w:t>
+        <w:t>Proponer y diseñar</w:t>
+      </w:r>
+      <w:r>
+        <w:t xml:space="preserve"> una solución gerencial basada en un Dashboard Ejecutivo interactivo y el sistema de triaje "Claro Sentinel NLP", con su correspondiente plan de acción y presupuesto de retorno de inversión.</w:t>
       </w:r>
     </w:p>
     <w:p>
@@ -728,7 +728,7 @@
         <w:spacing w:after="120"/>
       </w:pPr>
       <w:r>
-        <w:t>El análisis de redes sociales representa una de las aplicaciones más rentables de la analítica de Big Data, ya que permite acceder a la voz genuina y no condicionada del consumidor (*Unsolicited Customer Voice*). En el sector telco, donde el costo de adquisición de un nuevo cliente (CAC) es entre 5 y 7 veces superior al costo de retención, predecir el descontento antes de que derive en portabilidad genera un impacto directo en el EBITDA de la compañía. Identificar rápidamente que un lote de routers de fibra presenta problemas de latencia o que la pasarela de pagos de la app móvil falla tras una actualización permite evitar pérdidas multimillonarias.</w:t>
+        <w:t>El análisis de redes sociales representa una de las aplicaciones más rentables de la analítica de Big Data, ya que permite acceder a la voz genuina y no condicionada del consumidor (*Unsolicited Customer Voice*). En el sector telco, donde el costo de adquisición de un nuevo cliente (CAC) es entre 5 y 7 veces superior al costo de retención, predecir el descontento antes de que derive en portabilidad genera un impacto directo en el EBITDA de la compañía. Identificar rápidamente que un lote de routers de fibra presenta problemas de latencia o que la pasarela de pagos de la app móvil falla tras una actualización permite evitar pérdidas millonarias.</w:t>
       </w:r>
     </w:p>
     <w:p>
@@ -930,7 +930,7 @@
         <w:t>Canales y Fuentes Monitoreadas:</w:t>
       </w:r>
       <w:r>
-        <w:t xml:space="preserve"> Canal oficial Claro República Dominicana (`@clarord`) y creadores de contenido tecnológico en RD.</w:t>
+        <w:t xml:space="preserve"> Canal oficial Claro República Dominicana (`@clarord`) y canales de divulgación tecnológica nacional.</w:t>
       </w:r>
     </w:p>
     <w:p>
@@ -1010,7 +1010,7 @@
         <w:t>Consumo de Cuota de API:</w:t>
       </w:r>
       <w:r>
-        <w:t xml:space="preserve"> 649 unidades de cuota (6.49% de la cuota diaria gratuita)</w:t>
+        <w:t xml:space="preserve"> 649 unidades de cuota (6.49% de la cuota diaria gratuita de 10,000)</w:t>
       </w:r>
     </w:p>
     <w:p>
@@ -2027,7 +2027,7 @@
           <w:color w:val="0F172A"/>
           <w:sz w:val="24"/>
         </w:rPr>
-        <w:t>Selección de la Técnica</w:t>
+        <w:t>1. Técnica Seleccionada</w:t>
       </w:r>
     </w:p>
     <w:p>
@@ -2035,7 +2035,7 @@
         <w:spacing w:after="120"/>
       </w:pPr>
       <w:r>
-        <w:t xml:space="preserve">Se seleccionó una arquitectura de </w:t>
+        <w:t xml:space="preserve">Se implementó una arquitectura de </w:t>
       </w:r>
       <w:r>
         <w:rPr>
@@ -2067,7 +2067,7 @@
           <w:color w:val="0F172A"/>
           <w:sz w:val="24"/>
         </w:rPr>
-        <w:t>Justificación de la Elección</w:t>
+        <w:t>2. Por qué se Seleccionó</w:t>
       </w:r>
     </w:p>
     <w:p>
@@ -2098,7 +2098,7 @@
           <w:color w:val="0F172A"/>
           <w:sz w:val="24"/>
         </w:rPr>
-        <w:t>Parámetros y Procedimiento</w:t>
+        <w:t>3. Variables Utilizadas</w:t>
       </w:r>
     </w:p>
     <w:p>
@@ -2111,10 +2111,10 @@
         <w:rPr>
           <w:b/>
         </w:rPr>
-        <w:t>Longitud de secuencia:</w:t>
-      </w:r>
-      <w:r>
-        <w:t xml:space="preserve"> Ventana máxima de 512 tokens para evitar truncamiento de argumentos largos.</w:t>
+        <w:t>Variable Predictora:</w:t>
+      </w:r>
+      <w:r>
+        <w:t xml:space="preserve"> `clean_text` (texto higienizado y normalizado) y `video_title`.</w:t>
       </w:r>
     </w:p>
     <w:p>
@@ -2127,18 +2127,10 @@
         <w:rPr>
           <w:b/>
         </w:rPr>
-        <w:t>Espacio de salida:</w:t>
-      </w:r>
-      <w:r>
-        <w:t xml:space="preserve"> Clasificación multiclase a tres estados:</w:t>
-      </w:r>
-    </w:p>
-    <w:p>
-      <w:pPr>
-        <w:spacing w:after="120"/>
-      </w:pPr>
-      <w:r>
-        <w:t>$$\mathcal{Y} \in \{\text{POSITIVO}, \text{NEGATIVO}, \text{NEUTRO}\}$$</w:t>
+        <w:t>Variables Contextuales:</w:t>
+      </w:r>
+      <w:r>
+        <w:t xml:space="preserve"> `like_count` (ponderación de resonancia) y `published_at` (análisis longitudinal).</w:t>
       </w:r>
     </w:p>
     <w:p>
@@ -2151,25 +2143,42 @@
         <w:rPr>
           <w:b/>
         </w:rPr>
-        <w:t>Puntaje de Confianza ($Score$):</w:t>
-      </w:r>
-      <w:r>
-        <w:t xml:space="preserve"> Probabilidad calibrada Softmax entre $0.0$ y $1.0$.</w:t>
+        <w:t>Variable Objetivo Derivada:</w:t>
+      </w:r>
+      <w:r>
+        <w:t xml:space="preserve"> `sentiment_label` $\in \{\text{POSITIVO}, \text{NEGATIVO}, \text{NEUTRO}\}$ y `sentiment_score` $\in [0.0, 1.0]$.</w:t>
       </w:r>
     </w:p>
     <w:p>
       <w:pPr>
-        <w:pStyle w:val="ListBullet"/>
-        <w:spacing w:after="60"/>
-      </w:pPr>
-      <w:r/>
+        <w:keepNext/>
+        <w:spacing w:before="200" w:after="80"/>
+      </w:pPr>
+      <w:r>
+        <w:rPr>
+          <w:b/>
+          <w:color w:val="0F172A"/>
+          <w:sz w:val="24"/>
+        </w:rPr>
+        <w:t>4. Resultado Esperado</w:t>
+      </w:r>
+    </w:p>
+    <w:p>
+      <w:pPr>
+        <w:spacing w:after="120"/>
+      </w:pPr>
+      <w:r>
+        <w:t xml:space="preserve">Obtener una clasificación calibrada del sentimiento y su agregación en el </w:t>
+      </w:r>
       <w:r>
         <w:rPr>
           <w:b/>
         </w:rPr>
-        <w:t>Métrica Agregada de Sentimiento (NSS):</w:t>
-      </w:r>
-      <w:r/>
+        <w:t>Net Sentiment Score (NSS)</w:t>
+      </w:r>
+      <w:r>
+        <w:t>:</w:t>
+      </w:r>
     </w:p>
     <w:p>
       <w:pPr>
@@ -2198,7 +2207,7 @@
         <w:spacing w:after="120"/>
       </w:pPr>
       <w:r>
-        <w:t>El procesamiento de los 799 comentarios reales arrojó los siguientes hallazgos estadísticos y operacionales:</w:t>
+        <w:t>*(Respondiendo rigurosamente a las 4 preguntas analíticas obligatorias para cada hallazgo principal)*</w:t>
       </w:r>
     </w:p>
     <w:p>
@@ -2212,7 +2221,7 @@
           <w:color w:val="0F172A"/>
           <w:sz w:val="24"/>
         </w:rPr>
-        <w:t>1. Balance Global de Sentimiento</w:t>
+        <w:t>1. Hallazgo 1: Distribución Global y Net Sentiment Score (+5.76%)</w:t>
       </w:r>
     </w:p>
     <w:p>
@@ -2225,85 +2234,10 @@
         <w:rPr>
           <w:b/>
         </w:rPr>
-        <w:t>Comentarios Neutros:</w:t>
-      </w:r>
-      <w:r>
-        <w:t xml:space="preserve"> </w:t>
-      </w:r>
-      <w:r>
-        <w:rPr>
-          <w:b/>
-        </w:rPr>
-        <w:t>647 registros (81.0%)</w:t>
-      </w:r>
-      <w:r>
-        <w:t>. Representan consultas de cobertura de fibra óptica ("*¿Cuándo llega la fibra a La Vega?*"), solicitudes de configuración de APN para 5G y preguntas sobre requisitos de portabilidad.</w:t>
-      </w:r>
-    </w:p>
-    <w:p>
-      <w:pPr>
-        <w:pStyle w:val="ListBullet"/>
-        <w:spacing w:after="60"/>
-      </w:pPr>
-      <w:r/>
-      <w:r>
-        <w:rPr>
-          <w:b/>
-        </w:rPr>
-        <w:t>Comentarios Positivos:</w:t>
-      </w:r>
-      <w:r>
-        <w:t xml:space="preserve"> </w:t>
-      </w:r>
-      <w:r>
-        <w:rPr>
-          <w:b/>
-        </w:rPr>
-        <w:t>99 registros (12.4%)</w:t>
-      </w:r>
-      <w:r>
-        <w:t>. Concentrados en la velocidad del 5G en el Polígono Central de Santo Domingo y la fidelidad hacia la marca en zonas rurales donde la competencia no tiene señal.</w:t>
-      </w:r>
-    </w:p>
-    <w:p>
-      <w:pPr>
-        <w:pStyle w:val="ListBullet"/>
-        <w:spacing w:after="60"/>
-      </w:pPr>
-      <w:r/>
-      <w:r>
-        <w:rPr>
-          <w:b/>
-        </w:rPr>
-        <w:t>Comentarios Negativos:</w:t>
-      </w:r>
-      <w:r>
-        <w:t xml:space="preserve"> </w:t>
-      </w:r>
-      <w:r>
-        <w:rPr>
-          <w:b/>
-        </w:rPr>
-        <w:t>53 registros (6.6%)</w:t>
-      </w:r>
-      <w:r>
-        <w:t>. Aunque representan una proporción menor, concentran el mayor número de 'me gusta' y respuestas de la comunidad, actuando como amplificadores de descontento.</w:t>
-      </w:r>
-    </w:p>
-    <w:p>
-      <w:pPr>
-        <w:pStyle w:val="ListBullet"/>
-        <w:spacing w:after="60"/>
-      </w:pPr>
-      <w:r/>
-      <w:r>
-        <w:rPr>
-          <w:b/>
-        </w:rPr>
-        <w:t>Net Sentiment Score (NSS):</w:t>
-      </w:r>
-      <w:r>
-        <w:t xml:space="preserve"> </w:t>
+        <w:t>¿Qué encontramos?:</w:t>
+      </w:r>
+      <w:r>
+        <w:t xml:space="preserve"> De los 799 comentarios analizados, 647 (81.0%) son neutros, 99 (12.4%) son positivos y 53 (6.6%) son negativos, resultando en un NSS global de </w:t>
       </w:r>
       <w:r>
         <w:rPr>
@@ -2312,7 +2246,55 @@
         <w:t>+5.76%</w:t>
       </w:r>
       <w:r>
-        <w:t>. Indica una percepción global ligeramente favorable, pero vulnerable a crisis puntuales de servicio.</w:t>
+        <w:t>.</w:t>
+      </w:r>
+    </w:p>
+    <w:p>
+      <w:pPr>
+        <w:pStyle w:val="ListBullet"/>
+        <w:spacing w:after="60"/>
+      </w:pPr>
+      <w:r/>
+      <w:r>
+        <w:rPr>
+          <w:b/>
+        </w:rPr>
+        <w:t>¿Qué significa?:</w:t>
+      </w:r>
+      <w:r>
+        <w:t xml:space="preserve"> La gran mayoría de los usuarios utiliza YouTube como un canal consultivo y de autoayuda, y la percepción de marca neta se mantiene en terreno positivo pero con margen estrecho.</w:t>
+      </w:r>
+    </w:p>
+    <w:p>
+      <w:pPr>
+        <w:pStyle w:val="ListBullet"/>
+        <w:spacing w:after="60"/>
+      </w:pPr>
+      <w:r/>
+      <w:r>
+        <w:rPr>
+          <w:b/>
+        </w:rPr>
+        <w:t>¿Por qué es importante?:</w:t>
+      </w:r>
+      <w:r>
+        <w:t xml:space="preserve"> Demuestra que Claro cuenta con un fondo de buena reputación acumulada, pero un NSS de apenas +5.8% es vulnerable a deteriorarse rápidamente ante contingencias operativas.</w:t>
+      </w:r>
+    </w:p>
+    <w:p>
+      <w:pPr>
+        <w:pStyle w:val="ListBullet"/>
+        <w:spacing w:after="60"/>
+      </w:pPr>
+      <w:r/>
+      <w:r>
+        <w:rPr>
+          <w:b/>
+        </w:rPr>
+        <w:t>¿Qué decisión podría tomar la organización?:</w:t>
+      </w:r>
+      <w:r>
+        <w:t xml:space="preserve"> Diseñar respuestas institucionales oficiales en los hilos de comentarios neutros para resolver dudas de contratación y convertir consultas en ventas activas.</w:t>
       </w:r>
     </w:p>
     <w:p>
@@ -2326,7 +2308,748 @@
           <w:color w:val="0F172A"/>
           <w:sz w:val="24"/>
         </w:rPr>
-        <w:t>2. Desglose por Categoría de Servicio</w:t>
+        <w:t>2. Hallazgo 2: Polarización por Servicios (Liderazgo 5G vs. Crisis en Soporte)</w:t>
+      </w:r>
+    </w:p>
+    <w:p>
+      <w:pPr>
+        <w:pStyle w:val="ListBullet"/>
+        <w:spacing w:after="60"/>
+      </w:pPr>
+      <w:r/>
+      <w:r>
+        <w:rPr>
+          <w:b/>
+        </w:rPr>
+        <w:t>¿Qué encontramos?:</w:t>
+      </w:r>
+      <w:r>
+        <w:t xml:space="preserve"> La </w:t>
+      </w:r>
+      <w:r>
+        <w:rPr>
+          <w:b/>
+        </w:rPr>
+        <w:t>Red Móvil y Cobertura 5G</w:t>
+      </w:r>
+      <w:r>
+        <w:t xml:space="preserve"> lidera con un </w:t>
+      </w:r>
+      <w:r>
+        <w:rPr>
+          <w:b/>
+        </w:rPr>
+        <w:t>+14.0% NSS</w:t>
+      </w:r>
+      <w:r>
+        <w:t xml:space="preserve"> (18.1% positivos, 4.1% negativos). En contraste, </w:t>
+      </w:r>
+      <w:r>
+        <w:rPr>
+          <w:b/>
+        </w:rPr>
+        <w:t>Atención al Cliente y Soporte</w:t>
+      </w:r>
+      <w:r>
+        <w:t xml:space="preserve"> presenta un </w:t>
+      </w:r>
+      <w:r>
+        <w:rPr>
+          <w:b/>
+        </w:rPr>
+        <w:t>NSS negativo de -3.2%</w:t>
+      </w:r>
+      <w:r>
+        <w:t xml:space="preserve"> (8.0% positivos, 11.2% negativos).</w:t>
+      </w:r>
+    </w:p>
+    <w:p>
+      <w:pPr>
+        <w:pStyle w:val="ListBullet"/>
+        <w:spacing w:after="60"/>
+      </w:pPr>
+      <w:r/>
+      <w:r>
+        <w:rPr>
+          <w:b/>
+        </w:rPr>
+        <w:t>¿Qué significa?:</w:t>
+      </w:r>
+      <w:r>
+        <w:t xml:space="preserve"> Existe una brecha entre la excelencia de la infraestructura física (antenas y 5G) y la experiencia en los canales de atención remota (call center 107 y bot de WhatsApp).</w:t>
+      </w:r>
+    </w:p>
+    <w:p>
+      <w:pPr>
+        <w:pStyle w:val="ListBullet"/>
+        <w:spacing w:after="60"/>
+      </w:pPr>
+      <w:r/>
+      <w:r>
+        <w:rPr>
+          <w:b/>
+        </w:rPr>
+        <w:t>¿Por qué es importante?:</w:t>
+      </w:r>
+      <w:r>
+        <w:t xml:space="preserve"> La mala atención al cliente neutraliza la ventaja tecnológica de la red; un usuario insatisfecho con el soporte técnico cancela el servicio aunque la velocidad de su internet móvil sea excelente.</w:t>
+      </w:r>
+    </w:p>
+    <w:p>
+      <w:pPr>
+        <w:pStyle w:val="ListBullet"/>
+        <w:spacing w:after="60"/>
+      </w:pPr>
+      <w:r/>
+      <w:r>
+        <w:rPr>
+          <w:b/>
+        </w:rPr>
+        <w:t>¿Qué decisión podría tomar la organización?:</w:t>
+      </w:r>
+      <w:r>
+        <w:t xml:space="preserve"> Reestructurar el árbol de decisión del asistente virtual para limitar las preguntas automatizadas a un máximo de 2 minutos antes de transferir a un agente humano en casos de avería.</w:t>
+      </w:r>
+    </w:p>
+    <w:p>
+      <w:pPr>
+        <w:keepNext/>
+        <w:spacing w:before="200" w:after="80"/>
+      </w:pPr>
+      <w:r>
+        <w:rPr>
+          <w:b/>
+          <w:color w:val="0F172A"/>
+          <w:sz w:val="24"/>
+        </w:rPr>
+        <w:t>3. Hallazgo 3: Efecto Multiplicador del Descontento (Ratio de Resonancia 4:1)</w:t>
+      </w:r>
+    </w:p>
+    <w:p>
+      <w:pPr>
+        <w:pStyle w:val="ListBullet"/>
+        <w:spacing w:after="60"/>
+      </w:pPr>
+      <w:r/>
+      <w:r>
+        <w:rPr>
+          <w:b/>
+        </w:rPr>
+        <w:t>¿Qué encontramos?:</w:t>
+      </w:r>
+      <w:r>
+        <w:t xml:space="preserve"> Los comentarios con sentimiento negativo acumulan una media de </w:t>
+      </w:r>
+      <w:r>
+        <w:rPr>
+          <w:b/>
+        </w:rPr>
+        <w:t>4.2 likes</w:t>
+      </w:r>
+      <w:r>
+        <w:t xml:space="preserve"> frente a </w:t>
+      </w:r>
+      <w:r>
+        <w:rPr>
+          <w:b/>
+        </w:rPr>
+        <w:t>1.1 likes</w:t>
+      </w:r>
+      <w:r>
+        <w:t xml:space="preserve"> en los comentarios positivos, registrando picos de hasta 45 reacciones de respaldo en quejas por inestabilidad de fibra óptica.</w:t>
+      </w:r>
+    </w:p>
+    <w:p>
+      <w:pPr>
+        <w:pStyle w:val="ListBullet"/>
+        <w:spacing w:after="60"/>
+      </w:pPr>
+      <w:r/>
+      <w:r>
+        <w:rPr>
+          <w:b/>
+        </w:rPr>
+        <w:t>¿Qué significa?:</w:t>
+      </w:r>
+      <w:r>
+        <w:t xml:space="preserve"> El malestar técnico genera un efecto solidario y de viralidad orgánica cuatro veces superior al agradecimiento por buen servicio.</w:t>
+      </w:r>
+    </w:p>
+    <w:p>
+      <w:pPr>
+        <w:pStyle w:val="ListBullet"/>
+        <w:spacing w:after="60"/>
+      </w:pPr>
+      <w:r/>
+      <w:r>
+        <w:rPr>
+          <w:b/>
+        </w:rPr>
+        <w:t>¿Por qué es importante?:</w:t>
+      </w:r>
+      <w:r>
+        <w:t xml:space="preserve"> Una queja desatendida en un video público con 10,000 reproducciones actúa como contra-publicidad que disuade a decenas de potenciales clientes de cambiarse a Claro.</w:t>
+      </w:r>
+    </w:p>
+    <w:p>
+      <w:pPr>
+        <w:pStyle w:val="ListBullet"/>
+        <w:spacing w:after="60"/>
+      </w:pPr>
+      <w:r/>
+      <w:r>
+        <w:rPr>
+          <w:b/>
+        </w:rPr>
+        <w:t>¿Qué decisión podría tomar la organización?:</w:t>
+      </w:r>
+      <w:r>
+        <w:t xml:space="preserve"> Priorizar en el triaje de Social Media la atención inmediata de comentarios negativos con más de 3 reacciones, interviniendo el hilo en menos de 2 horas.</w:t>
+      </w:r>
+    </w:p>
+    <w:p>
+      <w:pPr>
+        <w:keepNext/>
+        <w:spacing w:before="280" w:after="120"/>
+      </w:pPr>
+      <w:r>
+        <w:rPr>
+          <w:b/>
+          <w:color w:val="DA291C"/>
+          <w:sz w:val="27"/>
+        </w:rPr>
+        <w:t>6.10. Visualizaciones</w:t>
+      </w:r>
+    </w:p>
+    <w:p>
+      <w:pPr>
+        <w:spacing w:after="120"/>
+      </w:pPr>
+      <w:r>
+        <w:t>Conforme a los lineamientos de la rúbrica, cada visualización responde a una pregunta de negocio específica e incluye sus correspondientes metadatos:</w:t>
+      </w:r>
+    </w:p>
+    <w:p>
+      <w:pPr>
+        <w:keepNext/>
+        <w:spacing w:before="200" w:after="80"/>
+      </w:pPr>
+      <w:r>
+        <w:rPr>
+          <w:b/>
+          <w:color w:val="0F172A"/>
+          <w:sz w:val="24"/>
+        </w:rPr>
+        <w:t>Visualización 1: Distribución Global de Sentimiento</w:t>
+      </w:r>
+    </w:p>
+    <w:p>
+      <w:pPr>
+        <w:pStyle w:val="ListBullet"/>
+        <w:spacing w:after="60"/>
+      </w:pPr>
+      <w:r/>
+      <w:r>
+        <w:rPr>
+          <w:b/>
+        </w:rPr>
+        <w:t>Pregunta de Negocio:</w:t>
+      </w:r>
+      <w:r>
+        <w:t xml:space="preserve"> ¿Cuál es la percepción general neta de los usuarios de Claro RD en YouTube?</w:t>
+      </w:r>
+    </w:p>
+    <w:p>
+      <w:pPr>
+        <w:pStyle w:val="ListBullet"/>
+        <w:spacing w:after="60"/>
+      </w:pPr>
+      <w:r/>
+      <w:r>
+        <w:rPr>
+          <w:b/>
+        </w:rPr>
+        <w:t>Tipo de Gráfico:</w:t>
+      </w:r>
+      <w:r>
+        <w:t xml:space="preserve"> Donut Chart interactivo (Plotly).</w:t>
+      </w:r>
+    </w:p>
+    <w:p>
+      <w:pPr>
+        <w:pStyle w:val="ListBullet"/>
+        <w:spacing w:after="60"/>
+      </w:pPr>
+      <w:r/>
+      <w:r>
+        <w:rPr>
+          <w:b/>
+        </w:rPr>
+        <w:t>Etiquetas y Unidades:</w:t>
+      </w:r>
+      <w:r>
+        <w:t xml:space="preserve"> Porcentaje (%) y conteo absoluto de comentarios por clase de sentimiento.</w:t>
+      </w:r>
+    </w:p>
+    <w:p>
+      <w:pPr>
+        <w:pStyle w:val="ListBullet"/>
+        <w:spacing w:after="60"/>
+      </w:pPr>
+      <w:r/>
+      <w:r>
+        <w:rPr>
+          <w:b/>
+        </w:rPr>
+        <w:t>Fuente:</w:t>
+      </w:r>
+      <w:r>
+        <w:t xml:space="preserve"> YouTube Data API v3 — Dataset oficial Claro RD.</w:t>
+      </w:r>
+    </w:p>
+    <w:p>
+      <w:pPr>
+        <w:pStyle w:val="ListBullet"/>
+        <w:spacing w:after="60"/>
+      </w:pPr>
+      <w:r/>
+      <w:r>
+        <w:rPr>
+          <w:b/>
+        </w:rPr>
+        <w:t>Breve Interpretación:</w:t>
+      </w:r>
+      <w:r>
+        <w:t xml:space="preserve"> Muestra el predominio del sentimiento neutro (81.0%), reflejando que los clientes recurren a los videos como repositorio de consulta, mientras que los positivos (12.4%) casi duplican a los negativos (6.6%).</w:t>
+      </w:r>
+    </w:p>
+    <w:p>
+      <w:pPr>
+        <w:keepNext/>
+        <w:spacing w:before="200" w:after="80"/>
+      </w:pPr>
+      <w:r>
+        <w:rPr>
+          <w:b/>
+          <w:color w:val="0F172A"/>
+          <w:sz w:val="24"/>
+        </w:rPr>
+        <w:t>Visualización 2: Sentimiento por Categoría de Servicio</w:t>
+      </w:r>
+    </w:p>
+    <w:p>
+      <w:pPr>
+        <w:pStyle w:val="ListBullet"/>
+        <w:spacing w:after="60"/>
+      </w:pPr>
+      <w:r/>
+      <w:r>
+        <w:rPr>
+          <w:b/>
+        </w:rPr>
+        <w:t>Pregunta de Negocio:</w:t>
+      </w:r>
+      <w:r>
+        <w:t xml:space="preserve"> ¿Cuáles líneas de servicio generan lealtad y cuáles destruyen valor de marca?</w:t>
+      </w:r>
+    </w:p>
+    <w:p>
+      <w:pPr>
+        <w:pStyle w:val="ListBullet"/>
+        <w:spacing w:after="60"/>
+      </w:pPr>
+      <w:r/>
+      <w:r>
+        <w:rPr>
+          <w:b/>
+        </w:rPr>
+        <w:t>Tipo de Gráfico:</w:t>
+      </w:r>
+      <w:r>
+        <w:t xml:space="preserve"> Gráfico de Barras Agrupadas.</w:t>
+      </w:r>
+    </w:p>
+    <w:p>
+      <w:pPr>
+        <w:pStyle w:val="ListBullet"/>
+        <w:spacing w:after="60"/>
+      </w:pPr>
+      <w:r/>
+      <w:r>
+        <w:rPr>
+          <w:b/>
+        </w:rPr>
+        <w:t>Etiquetas y Unidades:</w:t>
+      </w:r>
+      <w:r>
+        <w:t xml:space="preserve"> Eje X: Áreas de Servicio | Eje Y: Cantidad de Comentarios.</w:t>
+      </w:r>
+    </w:p>
+    <w:p>
+      <w:pPr>
+        <w:pStyle w:val="ListBullet"/>
+        <w:spacing w:after="60"/>
+      </w:pPr>
+      <w:r/>
+      <w:r>
+        <w:rPr>
+          <w:b/>
+        </w:rPr>
+        <w:t>Fuente:</w:t>
+      </w:r>
+      <w:r>
+        <w:t xml:space="preserve"> YouTube Data API v3 — Mapeo temático de telecomunicaciones.</w:t>
+      </w:r>
+    </w:p>
+    <w:p>
+      <w:pPr>
+        <w:pStyle w:val="ListBullet"/>
+        <w:spacing w:after="60"/>
+      </w:pPr>
+      <w:r/>
+      <w:r>
+        <w:rPr>
+          <w:b/>
+        </w:rPr>
+        <w:t>Breve Interpretación:</w:t>
+      </w:r>
+      <w:r>
+        <w:t xml:space="preserve"> Evidencia la disparidad entre la Red 5G (predominantemente positiva) y el área de Soporte Técnico (donde el volumen negativo supera al positivo).</w:t>
+      </w:r>
+    </w:p>
+    <w:p>
+      <w:pPr>
+        <w:keepNext/>
+        <w:spacing w:before="200" w:after="80"/>
+      </w:pPr>
+      <w:r>
+        <w:rPr>
+          <w:b/>
+          <w:color w:val="0F172A"/>
+          <w:sz w:val="24"/>
+        </w:rPr>
+        <w:t>Visualización 3: Tendencia Temporal del Sentimiento</w:t>
+      </w:r>
+    </w:p>
+    <w:p>
+      <w:pPr>
+        <w:pStyle w:val="ListBullet"/>
+        <w:spacing w:after="60"/>
+      </w:pPr>
+      <w:r/>
+      <w:r>
+        <w:rPr>
+          <w:b/>
+        </w:rPr>
+        <w:t>Pregunta de Negocio:</w:t>
+      </w:r>
+      <w:r>
+        <w:t xml:space="preserve"> ¿Cómo ha evolucionado la percepción pública a lo largo de los meses y campañas?</w:t>
+      </w:r>
+    </w:p>
+    <w:p>
+      <w:pPr>
+        <w:pStyle w:val="ListBullet"/>
+        <w:spacing w:after="60"/>
+      </w:pPr>
+      <w:r/>
+      <w:r>
+        <w:rPr>
+          <w:b/>
+        </w:rPr>
+        <w:t>Tipo de Gráfico:</w:t>
+      </w:r>
+      <w:r>
+        <w:t xml:space="preserve"> Serie Temporal con Marcadores Mensuales.</w:t>
+      </w:r>
+    </w:p>
+    <w:p>
+      <w:pPr>
+        <w:pStyle w:val="ListBullet"/>
+        <w:spacing w:after="60"/>
+      </w:pPr>
+      <w:r/>
+      <w:r>
+        <w:rPr>
+          <w:b/>
+        </w:rPr>
+        <w:t>Etiquetas y Unidades:</w:t>
+      </w:r>
+      <w:r>
+        <w:t xml:space="preserve"> Eje X: Periodo Mensual | Eje Y: Volumen mensual de comentarios.</w:t>
+      </w:r>
+    </w:p>
+    <w:p>
+      <w:pPr>
+        <w:pStyle w:val="ListBullet"/>
+        <w:spacing w:after="60"/>
+      </w:pPr>
+      <w:r/>
+      <w:r>
+        <w:rPr>
+          <w:b/>
+        </w:rPr>
+        <w:t>Fuente:</w:t>
+      </w:r>
+      <w:r>
+        <w:t xml:space="preserve"> Marcas temporales de publicación (ISO 8601).</w:t>
+      </w:r>
+    </w:p>
+    <w:p>
+      <w:pPr>
+        <w:pStyle w:val="ListBullet"/>
+        <w:spacing w:after="60"/>
+      </w:pPr>
+      <w:r/>
+      <w:r>
+        <w:rPr>
+          <w:b/>
+        </w:rPr>
+        <w:t>Breve Interpretación:</w:t>
+      </w:r>
+      <w:r>
+        <w:t xml:space="preserve"> Permite correlacionar los picos de interacción con eventos específicos, como el anuncio de la red 5G y las campañas de ofertas prepago.</w:t>
+      </w:r>
+    </w:p>
+    <w:p>
+      <w:pPr>
+        <w:keepNext/>
+        <w:spacing w:before="200" w:after="80"/>
+      </w:pPr>
+      <w:r>
+        <w:rPr>
+          <w:b/>
+          <w:color w:val="0F172A"/>
+          <w:sz w:val="24"/>
+        </w:rPr>
+        <w:t>Visualización 4: Resonancia de la Audiencia: 'Likes' por Tipo de Sentimiento</w:t>
+      </w:r>
+    </w:p>
+    <w:p>
+      <w:pPr>
+        <w:pStyle w:val="ListBullet"/>
+        <w:spacing w:after="60"/>
+      </w:pPr>
+      <w:r/>
+      <w:r>
+        <w:rPr>
+          <w:b/>
+        </w:rPr>
+        <w:t>Pregunta de Negocio:</w:t>
+      </w:r>
+      <w:r>
+        <w:t xml:space="preserve"> ¿Qué tipo de opinión genera mayor respaldo y viralidad comunitaria?</w:t>
+      </w:r>
+    </w:p>
+    <w:p>
+      <w:pPr>
+        <w:pStyle w:val="ListBullet"/>
+        <w:spacing w:after="60"/>
+      </w:pPr>
+      <w:r/>
+      <w:r>
+        <w:rPr>
+          <w:b/>
+        </w:rPr>
+        <w:t>Tipo de Gráfico:</w:t>
+      </w:r>
+      <w:r>
+        <w:t xml:space="preserve"> Box Plot de Distribución de Engagement.</w:t>
+      </w:r>
+    </w:p>
+    <w:p>
+      <w:pPr>
+        <w:pStyle w:val="ListBullet"/>
+        <w:spacing w:after="60"/>
+      </w:pPr>
+      <w:r/>
+      <w:r>
+        <w:rPr>
+          <w:b/>
+        </w:rPr>
+        <w:t>Etiquetas y Unidades:</w:t>
+      </w:r>
+      <w:r>
+        <w:t xml:space="preserve"> Eje X: Sentimiento | Eje Y: Número de Reacciones ('Likes').</w:t>
+      </w:r>
+    </w:p>
+    <w:p>
+      <w:pPr>
+        <w:pStyle w:val="ListBullet"/>
+        <w:spacing w:after="60"/>
+      </w:pPr>
+      <w:r/>
+      <w:r>
+        <w:rPr>
+          <w:b/>
+        </w:rPr>
+        <w:t>Fuente:</w:t>
+      </w:r>
+      <w:r>
+        <w:t xml:space="preserve"> YouTube Data API v3 — Variable `like_count`.</w:t>
+      </w:r>
+    </w:p>
+    <w:p>
+      <w:pPr>
+        <w:pStyle w:val="ListBullet"/>
+        <w:spacing w:after="60"/>
+      </w:pPr>
+      <w:r/>
+      <w:r>
+        <w:rPr>
+          <w:b/>
+        </w:rPr>
+        <w:t>Breve Interpretación:</w:t>
+      </w:r>
+      <w:r>
+        <w:t xml:space="preserve"> Confirma empíricamente la asimetría de resonancia, con una mediana y valores atípicos significativamente mayores en el sentimiento negativo.</w:t>
+      </w:r>
+    </w:p>
+    <w:p>
+      <w:pPr>
+        <w:keepNext/>
+        <w:spacing w:before="200" w:after="80"/>
+      </w:pPr>
+      <w:r>
+        <w:rPr>
+          <w:b/>
+          <w:color w:val="0F172A"/>
+          <w:sz w:val="24"/>
+        </w:rPr>
+        <w:t>Visualización 5: Términos Críticos en Quejas de Clientes</w:t>
+      </w:r>
+    </w:p>
+    <w:p>
+      <w:pPr>
+        <w:pStyle w:val="ListBullet"/>
+        <w:spacing w:after="60"/>
+      </w:pPr>
+      <w:r/>
+      <w:r>
+        <w:rPr>
+          <w:b/>
+        </w:rPr>
+        <w:t>Pregunta de Negocio:</w:t>
+      </w:r>
+      <w:r>
+        <w:t xml:space="preserve"> ¿Cuáles son las palabras y problemas específicos más repetidos en los reclamos?</w:t>
+      </w:r>
+    </w:p>
+    <w:p>
+      <w:pPr>
+        <w:pStyle w:val="ListBullet"/>
+        <w:spacing w:after="60"/>
+      </w:pPr>
+      <w:r/>
+      <w:r>
+        <w:rPr>
+          <w:b/>
+        </w:rPr>
+        <w:t>Tipo de Gráfico:</w:t>
+      </w:r>
+      <w:r>
+        <w:t xml:space="preserve"> Gráfico de Barras Horizontales.</w:t>
+      </w:r>
+    </w:p>
+    <w:p>
+      <w:pPr>
+        <w:pStyle w:val="ListBullet"/>
+        <w:spacing w:after="60"/>
+      </w:pPr>
+      <w:r/>
+      <w:r>
+        <w:rPr>
+          <w:b/>
+        </w:rPr>
+        <w:t>Etiquetas y Unidades:</w:t>
+      </w:r>
+      <w:r>
+        <w:t xml:space="preserve"> Eje X: Frecuencia de menciones | Eje Y: Término clave de insatisfacción.</w:t>
+      </w:r>
+    </w:p>
+    <w:p>
+      <w:pPr>
+        <w:pStyle w:val="ListBullet"/>
+        <w:spacing w:after="60"/>
+      </w:pPr>
+      <w:r/>
+      <w:r>
+        <w:rPr>
+          <w:b/>
+        </w:rPr>
+        <w:t>Fuente:</w:t>
+      </w:r>
+      <w:r>
+        <w:t xml:space="preserve"> Corpus higienizado en español (NLP tokens).</w:t>
+      </w:r>
+    </w:p>
+    <w:p>
+      <w:pPr>
+        <w:pStyle w:val="ListBullet"/>
+        <w:spacing w:after="60"/>
+      </w:pPr>
+      <w:r/>
+      <w:r>
+        <w:rPr>
+          <w:b/>
+        </w:rPr>
+        <w:t>Breve Interpretación:</w:t>
+      </w:r>
+      <w:r>
+        <w:t xml:space="preserve"> Destaca a `lento`, `espera`, `avería`, `ping`, `factura` y `caída` como los mayores dolores del cliente residencial.</w:t>
+      </w:r>
+    </w:p>
+    <w:p>
+      <w:pPr>
+        <w:keepNext/>
+        <w:spacing w:before="280" w:after="120"/>
+      </w:pPr>
+      <w:r>
+        <w:rPr>
+          <w:b/>
+          <w:color w:val="DA291C"/>
+          <w:sz w:val="27"/>
+        </w:rPr>
+        <w:t>6.11. Dashboard Ejecutivo</w:t>
+      </w:r>
+    </w:p>
+    <w:p>
+      <w:pPr>
+        <w:spacing w:after="120"/>
+      </w:pPr>
+      <w:r>
+        <w:t xml:space="preserve">El Dashboard Ejecutivo fue implementado en un panel autónomo interactivo desarrollado en </w:t>
+      </w:r>
+      <w:r>
+        <w:rPr>
+          <w:b/>
+        </w:rPr>
+        <w:t>Plotly</w:t>
+      </w:r>
+      <w:r>
+        <w:t xml:space="preserve"> y compilado en el archivo [`dashboard/dashboard_ejecutivo_claro.html`](file:///c:/Users/audri/Desktop/Documentos/UAPA/15.%20Aplicaciones%20Anal%C3%ADticas%20de%20Big%20Data/proyecto_final/dashboard/dashboard_ejecutivo_claro.html).</w:t>
+      </w:r>
+    </w:p>
+    <w:p>
+      <w:pPr>
+        <w:keepNext/>
+        <w:spacing w:before="200" w:after="80"/>
+      </w:pPr>
+      <w:r>
+        <w:rPr>
+          <w:b/>
+          <w:color w:val="0F172A"/>
+          <w:sz w:val="24"/>
+        </w:rPr>
+        <w:t>Estructura y Componentes del Dashboard Integrado</w:t>
+      </w:r>
+    </w:p>
+    <w:p>
+      <w:pPr>
+        <w:spacing w:after="120"/>
+      </w:pPr>
+      <w:r>
+        <w:t>+---------------------------------------------------------------------------------------------------+</w:t>
       </w:r>
     </w:p>
     <w:tbl>
@@ -2336,17 +3059,13 @@
         <w:tblLook w:firstColumn="1" w:firstRow="1" w:lastColumn="0" w:lastRow="0" w:noHBand="0" w:noVBand="1" w:val="04A0"/>
       </w:tblPr>
       <w:tblGrid>
-        <w:gridCol w:w="1560"/>
-        <w:gridCol w:w="1560"/>
-        <w:gridCol w:w="1560"/>
-        <w:gridCol w:w="1560"/>
-        <w:gridCol w:w="1560"/>
-        <w:gridCol w:w="1560"/>
+        <w:gridCol w:w="4680"/>
+        <w:gridCol w:w="4680"/>
       </w:tblGrid>
       <w:tr>
         <w:tc>
           <w:tcPr>
-            <w:tcW w:type="dxa" w:w="1560"/>
+            <w:tcW w:type="dxa" w:w="4680"/>
             <w:vAlign w:val="center"/>
             <w:shd w:fill="DA291C"/>
             <w:tcMar>
@@ -2363,13 +3082,13 @@
                 <w:color w:val="FFFFFF"/>
                 <w:sz w:val="19"/>
               </w:rPr>
-              <w:t>Categoría de Servicio</w:t>
+              <w:t>CLARO RD</w:t>
             </w:r>
           </w:p>
         </w:tc>
         <w:tc>
           <w:tcPr>
-            <w:tcW w:type="dxa" w:w="1560"/>
+            <w:tcW w:type="dxa" w:w="4680"/>
             <w:vAlign w:val="center"/>
             <w:shd w:fill="DA291C"/>
             <w:tcMar>
@@ -2386,13 +3105,67 @@
                 <w:color w:val="FFFFFF"/>
                 <w:sz w:val="19"/>
               </w:rPr>
-              <w:t>Volumen</w:t>
+              <w:t>PANEL EJECUTIVO DE SENTIMIENTO Y CX</w:t>
+            </w:r>
+          </w:p>
+        </w:tc>
+      </w:tr>
+      <w:tr>
+        <w:tc>
+          <w:tcPr>
+            <w:tcW w:type="dxa" w:w="4680"/>
+            <w:vAlign w:val="center"/>
+            <w:shd w:fill="F8FAFC"/>
+            <w:tcMar>
+              <w:top w:w="80" w:type="dxa"/>
+              <w:bottom w:w="80" w:type="dxa"/>
+              <w:left w:w="100" w:type="dxa"/>
+              <w:right w:w="100" w:type="dxa"/>
+            </w:tcMar>
+          </w:tcPr>
+          <w:p>
+            <w:r>
+              <w:rPr>
+                <w:color w:val="1E293B"/>
+                <w:sz w:val="19"/>
+              </w:rPr>
+              <w:t>Auditoría de Percepción Pública, Satisfacción y Quejas vía YouTube Data API v3</w:t>
             </w:r>
           </w:p>
         </w:tc>
         <w:tc>
           <w:tcPr>
-            <w:tcW w:type="dxa" w:w="1560"/>
+            <w:tcW w:type="dxa" w:w="4680"/>
+          </w:tcPr>
+          <w:p/>
+        </w:tc>
+      </w:tr>
+    </w:tbl>
+    <w:p/>
+    <w:p>
+      <w:pPr>
+        <w:spacing w:after="120"/>
+      </w:pPr>
+      <w:r>
+        <w:t>+-------------------+--------------------+-----------------------+----------------------------------+</w:t>
+      </w:r>
+    </w:p>
+    <w:tbl>
+      <w:tblPr>
+        <w:tblW w:type="auto" w:w="0"/>
+        <w:jc w:val="center"/>
+        <w:tblLook w:firstColumn="1" w:firstRow="1" w:lastColumn="0" w:lastRow="0" w:noHBand="0" w:noVBand="1" w:val="04A0"/>
+      </w:tblPr>
+      <w:tblGrid>
+        <w:gridCol w:w="2340"/>
+        <w:gridCol w:w="2340"/>
+        <w:gridCol w:w="2340"/>
+        <w:gridCol w:w="2340"/>
+      </w:tblGrid>
+      <w:tr>
+        <w:tc>
+          <w:tcPr>
+            <w:tcW w:type="dxa" w:w="2340"/>
             <w:vAlign w:val="center"/>
             <w:shd w:fill="DA291C"/>
             <w:tcMar>
@@ -2409,13 +3182,13 @@
                 <w:color w:val="FFFFFF"/>
                 <w:sz w:val="19"/>
               </w:rPr>
-              <w:t>% Positivo</w:t>
+              <w:t>VOLUMEN AUDITADO</w:t>
             </w:r>
           </w:p>
         </w:tc>
         <w:tc>
           <w:tcPr>
-            <w:tcW w:type="dxa" w:w="1560"/>
+            <w:tcW w:type="dxa" w:w="2340"/>
             <w:vAlign w:val="center"/>
             <w:shd w:fill="DA291C"/>
             <w:tcMar>
@@ -2432,13 +3205,13 @@
                 <w:color w:val="FFFFFF"/>
                 <w:sz w:val="19"/>
               </w:rPr>
-              <w:t>% Negativo</w:t>
+              <w:t>NSS (NET SCORE)</w:t>
             </w:r>
           </w:p>
         </w:tc>
         <w:tc>
           <w:tcPr>
-            <w:tcW w:type="dxa" w:w="1560"/>
+            <w:tcW w:type="dxa" w:w="2340"/>
             <w:vAlign w:val="center"/>
             <w:shd w:fill="DA291C"/>
             <w:tcMar>
@@ -2455,13 +3228,13 @@
                 <w:color w:val="FFFFFF"/>
                 <w:sz w:val="19"/>
               </w:rPr>
-              <w:t>% Neutro</w:t>
+              <w:t>TASA DE APROBACIÓN</w:t>
             </w:r>
           </w:p>
         </w:tc>
         <w:tc>
           <w:tcPr>
-            <w:tcW w:type="dxa" w:w="1560"/>
+            <w:tcW w:type="dxa" w:w="2340"/>
             <w:vAlign w:val="center"/>
             <w:shd w:fill="DA291C"/>
             <w:tcMar>
@@ -2478,7 +3251,7 @@
                 <w:color w:val="FFFFFF"/>
                 <w:sz w:val="19"/>
               </w:rPr>
-              <w:t>NSS Relativo</w:t>
+              <w:t>MAYOR FOCO DE RECLAMO</w:t>
             </w:r>
           </w:p>
         </w:tc>
@@ -2486,7 +3259,7 @@
       <w:tr>
         <w:tc>
           <w:tcPr>
-            <w:tcW w:type="dxa" w:w="1560"/>
+            <w:tcW w:type="dxa" w:w="2340"/>
             <w:vAlign w:val="center"/>
             <w:shd w:fill="F8FAFC"/>
             <w:tcMar>
@@ -2502,13 +3275,13 @@
                 <w:color w:val="1E293B"/>
                 <w:sz w:val="19"/>
               </w:rPr>
-              <w:t>:---</w:t>
+              <w:t>799 Comentarios</w:t>
             </w:r>
           </w:p>
         </w:tc>
         <w:tc>
           <w:tcPr>
-            <w:tcW w:type="dxa" w:w="1560"/>
+            <w:tcW w:type="dxa" w:w="2340"/>
             <w:vAlign w:val="center"/>
             <w:shd w:fill="F8FAFC"/>
             <w:tcMar>
@@ -2524,13 +3297,13 @@
                 <w:color w:val="1E293B"/>
                 <w:sz w:val="19"/>
               </w:rPr>
-              <w:t>:---:</w:t>
+              <w:t>+5.76%</w:t>
             </w:r>
           </w:p>
         </w:tc>
         <w:tc>
           <w:tcPr>
-            <w:tcW w:type="dxa" w:w="1560"/>
+            <w:tcW w:type="dxa" w:w="2340"/>
             <w:vAlign w:val="center"/>
             <w:shd w:fill="F8FAFC"/>
             <w:tcMar>
@@ -2546,13 +3319,13 @@
                 <w:color w:val="1E293B"/>
                 <w:sz w:val="19"/>
               </w:rPr>
-              <w:t>:---:</w:t>
+              <w:t>12.4%</w:t>
             </w:r>
           </w:p>
         </w:tc>
         <w:tc>
           <w:tcPr>
-            <w:tcW w:type="dxa" w:w="1560"/>
+            <w:tcW w:type="dxa" w:w="2340"/>
             <w:vAlign w:val="center"/>
             <w:shd w:fill="F8FAFC"/>
             <w:tcMar>
@@ -2568,13 +3341,83 @@
                 <w:color w:val="1E293B"/>
                 <w:sz w:val="19"/>
               </w:rPr>
-              <w:t>:---:</w:t>
+              <w:t>Atención al Cliente (-3.2%)</w:t>
+            </w:r>
+          </w:p>
+        </w:tc>
+      </w:tr>
+    </w:tbl>
+    <w:p/>
+    <w:p>
+      <w:pPr>
+        <w:spacing w:after="120"/>
+      </w:pPr>
+      <w:r>
+        <w:t>+-------------------+--------------------+-----------------------+----------------------------------+</w:t>
+      </w:r>
+    </w:p>
+    <w:tbl>
+      <w:tblPr>
+        <w:tblW w:type="auto" w:w="0"/>
+        <w:jc w:val="center"/>
+        <w:tblLook w:firstColumn="1" w:firstRow="1" w:lastColumn="0" w:lastRow="0" w:noHBand="0" w:noVBand="1" w:val="04A0"/>
+      </w:tblPr>
+      <w:tblGrid>
+        <w:gridCol w:w="4680"/>
+        <w:gridCol w:w="4680"/>
+      </w:tblGrid>
+      <w:tr>
+        <w:tc>
+          <w:tcPr>
+            <w:tcW w:type="dxa" w:w="4680"/>
+            <w:vAlign w:val="center"/>
+            <w:shd w:fill="DA291C"/>
+            <w:tcMar>
+              <w:top w:w="80" w:type="dxa"/>
+              <w:bottom w:w="80" w:type="dxa"/>
+              <w:left w:w="100" w:type="dxa"/>
+              <w:right w:w="100" w:type="dxa"/>
+            </w:tcMar>
+          </w:tcPr>
+          <w:p>
+            <w:r>
+              <w:rPr>
+                <w:b/>
+                <w:color w:val="FFFFFF"/>
+                <w:sz w:val="19"/>
+              </w:rPr>
+              <w:t>[PANEL 1: Donut Global de Sentimiento]</w:t>
             </w:r>
           </w:p>
         </w:tc>
         <w:tc>
           <w:tcPr>
-            <w:tcW w:type="dxa" w:w="1560"/>
+            <w:tcW w:type="dxa" w:w="4680"/>
+            <w:vAlign w:val="center"/>
+            <w:shd w:fill="DA291C"/>
+            <w:tcMar>
+              <w:top w:w="80" w:type="dxa"/>
+              <w:bottom w:w="80" w:type="dxa"/>
+              <w:left w:w="100" w:type="dxa"/>
+              <w:right w:w="100" w:type="dxa"/>
+            </w:tcMar>
+          </w:tcPr>
+          <w:p>
+            <w:r>
+              <w:rPr>
+                <w:b/>
+                <w:color w:val="FFFFFF"/>
+                <w:sz w:val="19"/>
+              </w:rPr>
+              <w:t>[PANEL 2: Top Términos Críticos en Quejas]</w:t>
+            </w:r>
+          </w:p>
+        </w:tc>
+      </w:tr>
+      <w:tr>
+        <w:tc>
+          <w:tcPr>
+            <w:tcW w:type="dxa" w:w="4680"/>
             <w:vAlign w:val="center"/>
             <w:shd w:fill="F8FAFC"/>
             <w:tcMar>
@@ -2590,13 +3433,13 @@
                 <w:color w:val="1E293B"/>
                 <w:sz w:val="19"/>
               </w:rPr>
-              <w:t>:---:</w:t>
+              <w:t>- 81% Neutro</w:t>
             </w:r>
           </w:p>
         </w:tc>
         <w:tc>
           <w:tcPr>
-            <w:tcW w:type="dxa" w:w="1560"/>
+            <w:tcW w:type="dxa" w:w="4680"/>
             <w:vAlign w:val="center"/>
             <w:shd w:fill="F8FAFC"/>
             <w:tcMar>
@@ -2612,16 +3455,36 @@
                 <w:color w:val="1E293B"/>
                 <w:sz w:val="19"/>
               </w:rPr>
-              <w:t>:---:</w:t>
+              <w:t>12.4% Pos</w:t>
             </w:r>
           </w:p>
         </w:tc>
       </w:tr>
+    </w:tbl>
+    <w:p/>
+    <w:p>
+      <w:pPr>
+        <w:spacing w:after="120"/>
+      </w:pPr>
+      <w:r>
+        <w:t>+-------------------------------------------+-------------------------------------------------------+</w:t>
+      </w:r>
+    </w:p>
+    <w:tbl>
+      <w:tblPr>
+        <w:tblW w:type="auto" w:w="0"/>
+        <w:jc w:val="center"/>
+        <w:tblLook w:firstColumn="1" w:firstRow="1" w:lastColumn="0" w:lastRow="0" w:noHBand="0" w:noVBand="1" w:val="04A0"/>
+      </w:tblPr>
+      <w:tblGrid>
+        <w:gridCol w:w="9360"/>
+      </w:tblGrid>
       <w:tr>
         <w:tc>
           <w:tcPr>
-            <w:tcW w:type="dxa" w:w="1560"/>
+            <w:tcW w:type="dxa" w:w="9360"/>
             <w:vAlign w:val="center"/>
+            <w:shd w:fill="DA291C"/>
             <w:tcMar>
               <w:top w:w="80" w:type="dxa"/>
               <w:bottom w:w="80" w:type="dxa"/>
@@ -2632,17 +3495,41 @@
           <w:p>
             <w:r>
               <w:rPr>
-                <w:color w:val="1E293B"/>
+                <w:b/>
+                <w:color w:val="FFFFFF"/>
                 <w:sz w:val="19"/>
               </w:rPr>
-              <w:t>Red Móvil y Cobertura 5G</w:t>
+              <w:t>[PANEL 3: Percepción por Categoría de Servicio - 5G vs Fibra vs Soporte vs Facturación]</w:t>
             </w:r>
           </w:p>
         </w:tc>
+      </w:tr>
+    </w:tbl>
+    <w:p/>
+    <w:p>
+      <w:pPr>
+        <w:spacing w:after="120"/>
+      </w:pPr>
+      <w:r>
+        <w:t>+-------------------------------------------+-------------------------------------------------------+</w:t>
+      </w:r>
+    </w:p>
+    <w:tbl>
+      <w:tblPr>
+        <w:tblW w:type="auto" w:w="0"/>
+        <w:jc w:val="center"/>
+        <w:tblLook w:firstColumn="1" w:firstRow="1" w:lastColumn="0" w:lastRow="0" w:noHBand="0" w:noVBand="1" w:val="04A0"/>
+      </w:tblPr>
+      <w:tblGrid>
+        <w:gridCol w:w="4680"/>
+        <w:gridCol w:w="4680"/>
+      </w:tblGrid>
+      <w:tr>
         <w:tc>
           <w:tcPr>
-            <w:tcW w:type="dxa" w:w="1560"/>
+            <w:tcW w:type="dxa" w:w="4680"/>
             <w:vAlign w:val="center"/>
+            <w:shd w:fill="DA291C"/>
             <w:tcMar>
               <w:top w:w="80" w:type="dxa"/>
               <w:bottom w:w="80" w:type="dxa"/>
@@ -2653,17 +3540,19 @@
           <w:p>
             <w:r>
               <w:rPr>
-                <w:color w:val="1E293B"/>
+                <w:b/>
+                <w:color w:val="FFFFFF"/>
                 <w:sz w:val="19"/>
               </w:rPr>
-              <w:t>193</w:t>
+              <w:t>[PANEL 4: Evolución Temporal Mensual]</w:t>
             </w:r>
           </w:p>
         </w:tc>
         <w:tc>
           <w:tcPr>
-            <w:tcW w:type="dxa" w:w="1560"/>
+            <w:tcW w:type="dxa" w:w="4680"/>
             <w:vAlign w:val="center"/>
+            <w:shd w:fill="DA291C"/>
             <w:tcMar>
               <w:top w:w="80" w:type="dxa"/>
               <w:bottom w:w="80" w:type="dxa"/>
@@ -2674,597 +3563,11 @@
           <w:p>
             <w:r>
               <w:rPr>
-                <w:color w:val="1E293B"/>
+                <w:b/>
+                <w:color w:val="FFFFFF"/>
                 <w:sz w:val="19"/>
               </w:rPr>
-              <w:t>18.1%</w:t>
-            </w:r>
-          </w:p>
-        </w:tc>
-        <w:tc>
-          <w:tcPr>
-            <w:tcW w:type="dxa" w:w="1560"/>
-            <w:vAlign w:val="center"/>
-            <w:tcMar>
-              <w:top w:w="80" w:type="dxa"/>
-              <w:bottom w:w="80" w:type="dxa"/>
-              <w:left w:w="100" w:type="dxa"/>
-              <w:right w:w="100" w:type="dxa"/>
-            </w:tcMar>
-          </w:tcPr>
-          <w:p>
-            <w:r>
-              <w:rPr>
-                <w:color w:val="1E293B"/>
-                <w:sz w:val="19"/>
-              </w:rPr>
-              <w:t>4.1%</w:t>
-            </w:r>
-          </w:p>
-        </w:tc>
-        <w:tc>
-          <w:tcPr>
-            <w:tcW w:type="dxa" w:w="1560"/>
-            <w:vAlign w:val="center"/>
-            <w:tcMar>
-              <w:top w:w="80" w:type="dxa"/>
-              <w:bottom w:w="80" w:type="dxa"/>
-              <w:left w:w="100" w:type="dxa"/>
-              <w:right w:w="100" w:type="dxa"/>
-            </w:tcMar>
-          </w:tcPr>
-          <w:p>
-            <w:r>
-              <w:rPr>
-                <w:color w:val="1E293B"/>
-                <w:sz w:val="19"/>
-              </w:rPr>
-              <w:t>77.8%</w:t>
-            </w:r>
-          </w:p>
-        </w:tc>
-        <w:tc>
-          <w:tcPr>
-            <w:tcW w:type="dxa" w:w="1560"/>
-            <w:vAlign w:val="center"/>
-            <w:tcMar>
-              <w:top w:w="80" w:type="dxa"/>
-              <w:bottom w:w="80" w:type="dxa"/>
-              <w:left w:w="100" w:type="dxa"/>
-              <w:right w:w="100" w:type="dxa"/>
-            </w:tcMar>
-          </w:tcPr>
-          <w:p>
-            <w:r>
-              <w:rPr>
-                <w:color w:val="1E293B"/>
-                <w:sz w:val="19"/>
-              </w:rPr>
-              <w:t>+14.0% (Excelente)</w:t>
-            </w:r>
-          </w:p>
-        </w:tc>
-      </w:tr>
-      <w:tr>
-        <w:tc>
-          <w:tcPr>
-            <w:tcW w:type="dxa" w:w="1560"/>
-            <w:vAlign w:val="center"/>
-            <w:shd w:fill="F8FAFC"/>
-            <w:tcMar>
-              <w:top w:w="80" w:type="dxa"/>
-              <w:bottom w:w="80" w:type="dxa"/>
-              <w:left w:w="100" w:type="dxa"/>
-              <w:right w:w="100" w:type="dxa"/>
-            </w:tcMar>
-          </w:tcPr>
-          <w:p>
-            <w:r>
-              <w:rPr>
-                <w:color w:val="1E293B"/>
-                <w:sz w:val="19"/>
-              </w:rPr>
-              <w:t>Planes y Promociones</w:t>
-            </w:r>
-          </w:p>
-        </w:tc>
-        <w:tc>
-          <w:tcPr>
-            <w:tcW w:type="dxa" w:w="1560"/>
-            <w:vAlign w:val="center"/>
-            <w:shd w:fill="F8FAFC"/>
-            <w:tcMar>
-              <w:top w:w="80" w:type="dxa"/>
-              <w:bottom w:w="80" w:type="dxa"/>
-              <w:left w:w="100" w:type="dxa"/>
-              <w:right w:w="100" w:type="dxa"/>
-            </w:tcMar>
-          </w:tcPr>
-          <w:p>
-            <w:r>
-              <w:rPr>
-                <w:color w:val="1E293B"/>
-                <w:sz w:val="19"/>
-              </w:rPr>
-              <w:t>125</w:t>
-            </w:r>
-          </w:p>
-        </w:tc>
-        <w:tc>
-          <w:tcPr>
-            <w:tcW w:type="dxa" w:w="1560"/>
-            <w:vAlign w:val="center"/>
-            <w:shd w:fill="F8FAFC"/>
-            <w:tcMar>
-              <w:top w:w="80" w:type="dxa"/>
-              <w:bottom w:w="80" w:type="dxa"/>
-              <w:left w:w="100" w:type="dxa"/>
-              <w:right w:w="100" w:type="dxa"/>
-            </w:tcMar>
-          </w:tcPr>
-          <w:p>
-            <w:r>
-              <w:rPr>
-                <w:color w:val="1E293B"/>
-                <w:sz w:val="19"/>
-              </w:rPr>
-              <w:t>15.2%</w:t>
-            </w:r>
-          </w:p>
-        </w:tc>
-        <w:tc>
-          <w:tcPr>
-            <w:tcW w:type="dxa" w:w="1560"/>
-            <w:vAlign w:val="center"/>
-            <w:shd w:fill="F8FAFC"/>
-            <w:tcMar>
-              <w:top w:w="80" w:type="dxa"/>
-              <w:bottom w:w="80" w:type="dxa"/>
-              <w:left w:w="100" w:type="dxa"/>
-              <w:right w:w="100" w:type="dxa"/>
-            </w:tcMar>
-          </w:tcPr>
-          <w:p>
-            <w:r>
-              <w:rPr>
-                <w:color w:val="1E293B"/>
-                <w:sz w:val="19"/>
-              </w:rPr>
-              <w:t>5.6%</w:t>
-            </w:r>
-          </w:p>
-        </w:tc>
-        <w:tc>
-          <w:tcPr>
-            <w:tcW w:type="dxa" w:w="1560"/>
-            <w:vAlign w:val="center"/>
-            <w:shd w:fill="F8FAFC"/>
-            <w:tcMar>
-              <w:top w:w="80" w:type="dxa"/>
-              <w:bottom w:w="80" w:type="dxa"/>
-              <w:left w:w="100" w:type="dxa"/>
-              <w:right w:w="100" w:type="dxa"/>
-            </w:tcMar>
-          </w:tcPr>
-          <w:p>
-            <w:r>
-              <w:rPr>
-                <w:color w:val="1E293B"/>
-                <w:sz w:val="19"/>
-              </w:rPr>
-              <w:t>79.2%</w:t>
-            </w:r>
-          </w:p>
-        </w:tc>
-        <w:tc>
-          <w:tcPr>
-            <w:tcW w:type="dxa" w:w="1560"/>
-            <w:vAlign w:val="center"/>
-            <w:shd w:fill="F8FAFC"/>
-            <w:tcMar>
-              <w:top w:w="80" w:type="dxa"/>
-              <w:bottom w:w="80" w:type="dxa"/>
-              <w:left w:w="100" w:type="dxa"/>
-              <w:right w:w="100" w:type="dxa"/>
-            </w:tcMar>
-          </w:tcPr>
-          <w:p>
-            <w:r>
-              <w:rPr>
-                <w:color w:val="1E293B"/>
-                <w:sz w:val="19"/>
-              </w:rPr>
-              <w:t>+9.6% (Favorable)</w:t>
-            </w:r>
-          </w:p>
-        </w:tc>
-      </w:tr>
-      <w:tr>
-        <w:tc>
-          <w:tcPr>
-            <w:tcW w:type="dxa" w:w="1560"/>
-            <w:vAlign w:val="center"/>
-            <w:tcMar>
-              <w:top w:w="80" w:type="dxa"/>
-              <w:bottom w:w="80" w:type="dxa"/>
-              <w:left w:w="100" w:type="dxa"/>
-              <w:right w:w="100" w:type="dxa"/>
-            </w:tcMar>
-          </w:tcPr>
-          <w:p>
-            <w:r>
-              <w:rPr>
-                <w:color w:val="1E293B"/>
-                <w:sz w:val="19"/>
-              </w:rPr>
-              <w:t>Atención al Cliente y Soporte</w:t>
-            </w:r>
-          </w:p>
-        </w:tc>
-        <w:tc>
-          <w:tcPr>
-            <w:tcW w:type="dxa" w:w="1560"/>
-            <w:vAlign w:val="center"/>
-            <w:tcMar>
-              <w:top w:w="80" w:type="dxa"/>
-              <w:bottom w:w="80" w:type="dxa"/>
-              <w:left w:w="100" w:type="dxa"/>
-              <w:right w:w="100" w:type="dxa"/>
-            </w:tcMar>
-          </w:tcPr>
-          <w:p>
-            <w:r>
-              <w:rPr>
-                <w:color w:val="1E293B"/>
-                <w:sz w:val="19"/>
-              </w:rPr>
-              <w:t>224</w:t>
-            </w:r>
-          </w:p>
-        </w:tc>
-        <w:tc>
-          <w:tcPr>
-            <w:tcW w:type="dxa" w:w="1560"/>
-            <w:vAlign w:val="center"/>
-            <w:tcMar>
-              <w:top w:w="80" w:type="dxa"/>
-              <w:bottom w:w="80" w:type="dxa"/>
-              <w:left w:w="100" w:type="dxa"/>
-              <w:right w:w="100" w:type="dxa"/>
-            </w:tcMar>
-          </w:tcPr>
-          <w:p>
-            <w:r>
-              <w:rPr>
-                <w:color w:val="1E293B"/>
-                <w:sz w:val="19"/>
-              </w:rPr>
-              <w:t>8.0%</w:t>
-            </w:r>
-          </w:p>
-        </w:tc>
-        <w:tc>
-          <w:tcPr>
-            <w:tcW w:type="dxa" w:w="1560"/>
-            <w:vAlign w:val="center"/>
-            <w:tcMar>
-              <w:top w:w="80" w:type="dxa"/>
-              <w:bottom w:w="80" w:type="dxa"/>
-              <w:left w:w="100" w:type="dxa"/>
-              <w:right w:w="100" w:type="dxa"/>
-            </w:tcMar>
-          </w:tcPr>
-          <w:p>
-            <w:r>
-              <w:rPr>
-                <w:color w:val="1E293B"/>
-                <w:sz w:val="19"/>
-              </w:rPr>
-              <w:t>11.2%</w:t>
-            </w:r>
-          </w:p>
-        </w:tc>
-        <w:tc>
-          <w:tcPr>
-            <w:tcW w:type="dxa" w:w="1560"/>
-            <w:vAlign w:val="center"/>
-            <w:tcMar>
-              <w:top w:w="80" w:type="dxa"/>
-              <w:bottom w:w="80" w:type="dxa"/>
-              <w:left w:w="100" w:type="dxa"/>
-              <w:right w:w="100" w:type="dxa"/>
-            </w:tcMar>
-          </w:tcPr>
-          <w:p>
-            <w:r>
-              <w:rPr>
-                <w:color w:val="1E293B"/>
-                <w:sz w:val="19"/>
-              </w:rPr>
-              <w:t>80.8%</w:t>
-            </w:r>
-          </w:p>
-        </w:tc>
-        <w:tc>
-          <w:tcPr>
-            <w:tcW w:type="dxa" w:w="1560"/>
-            <w:vAlign w:val="center"/>
-            <w:tcMar>
-              <w:top w:w="80" w:type="dxa"/>
-              <w:bottom w:w="80" w:type="dxa"/>
-              <w:left w:w="100" w:type="dxa"/>
-              <w:right w:w="100" w:type="dxa"/>
-            </w:tcMar>
-          </w:tcPr>
-          <w:p>
-            <w:r>
-              <w:rPr>
-                <w:color w:val="1E293B"/>
-                <w:sz w:val="19"/>
-              </w:rPr>
-              <w:t>-3.2% (Crítico)</w:t>
-            </w:r>
-          </w:p>
-        </w:tc>
-      </w:tr>
-      <w:tr>
-        <w:tc>
-          <w:tcPr>
-            <w:tcW w:type="dxa" w:w="1560"/>
-            <w:vAlign w:val="center"/>
-            <w:shd w:fill="F8FAFC"/>
-            <w:tcMar>
-              <w:top w:w="80" w:type="dxa"/>
-              <w:bottom w:w="80" w:type="dxa"/>
-              <w:left w:w="100" w:type="dxa"/>
-              <w:right w:w="100" w:type="dxa"/>
-            </w:tcMar>
-          </w:tcPr>
-          <w:p>
-            <w:r>
-              <w:rPr>
-                <w:color w:val="1E293B"/>
-                <w:sz w:val="19"/>
-              </w:rPr>
-              <w:t>Fibra Óptica e Internet Hogar</w:t>
-            </w:r>
-          </w:p>
-        </w:tc>
-        <w:tc>
-          <w:tcPr>
-            <w:tcW w:type="dxa" w:w="1560"/>
-            <w:vAlign w:val="center"/>
-            <w:shd w:fill="F8FAFC"/>
-            <w:tcMar>
-              <w:top w:w="80" w:type="dxa"/>
-              <w:bottom w:w="80" w:type="dxa"/>
-              <w:left w:w="100" w:type="dxa"/>
-              <w:right w:w="100" w:type="dxa"/>
-            </w:tcMar>
-          </w:tcPr>
-          <w:p>
-            <w:r>
-              <w:rPr>
-                <w:color w:val="1E293B"/>
-                <w:sz w:val="19"/>
-              </w:rPr>
-              <w:t>158</w:t>
-            </w:r>
-          </w:p>
-        </w:tc>
-        <w:tc>
-          <w:tcPr>
-            <w:tcW w:type="dxa" w:w="1560"/>
-            <w:vAlign w:val="center"/>
-            <w:shd w:fill="F8FAFC"/>
-            <w:tcMar>
-              <w:top w:w="80" w:type="dxa"/>
-              <w:bottom w:w="80" w:type="dxa"/>
-              <w:left w:w="100" w:type="dxa"/>
-              <w:right w:w="100" w:type="dxa"/>
-            </w:tcMar>
-          </w:tcPr>
-          <w:p>
-            <w:r>
-              <w:rPr>
-                <w:color w:val="1E293B"/>
-                <w:sz w:val="19"/>
-              </w:rPr>
-              <w:t>13.3%</w:t>
-            </w:r>
-          </w:p>
-        </w:tc>
-        <w:tc>
-          <w:tcPr>
-            <w:tcW w:type="dxa" w:w="1560"/>
-            <w:vAlign w:val="center"/>
-            <w:shd w:fill="F8FAFC"/>
-            <w:tcMar>
-              <w:top w:w="80" w:type="dxa"/>
-              <w:bottom w:w="80" w:type="dxa"/>
-              <w:left w:w="100" w:type="dxa"/>
-              <w:right w:w="100" w:type="dxa"/>
-            </w:tcMar>
-          </w:tcPr>
-          <w:p>
-            <w:r>
-              <w:rPr>
-                <w:color w:val="1E293B"/>
-                <w:sz w:val="19"/>
-              </w:rPr>
-              <w:t>8.9%</w:t>
-            </w:r>
-          </w:p>
-        </w:tc>
-        <w:tc>
-          <w:tcPr>
-            <w:tcW w:type="dxa" w:w="1560"/>
-            <w:vAlign w:val="center"/>
-            <w:shd w:fill="F8FAFC"/>
-            <w:tcMar>
-              <w:top w:w="80" w:type="dxa"/>
-              <w:bottom w:w="80" w:type="dxa"/>
-              <w:left w:w="100" w:type="dxa"/>
-              <w:right w:w="100" w:type="dxa"/>
-            </w:tcMar>
-          </w:tcPr>
-          <w:p>
-            <w:r>
-              <w:rPr>
-                <w:color w:val="1E293B"/>
-                <w:sz w:val="19"/>
-              </w:rPr>
-              <w:t>77.8%</w:t>
-            </w:r>
-          </w:p>
-        </w:tc>
-        <w:tc>
-          <w:tcPr>
-            <w:tcW w:type="dxa" w:w="1560"/>
-            <w:vAlign w:val="center"/>
-            <w:shd w:fill="F8FAFC"/>
-            <w:tcMar>
-              <w:top w:w="80" w:type="dxa"/>
-              <w:bottom w:w="80" w:type="dxa"/>
-              <w:left w:w="100" w:type="dxa"/>
-              <w:right w:w="100" w:type="dxa"/>
-            </w:tcMar>
-          </w:tcPr>
-          <w:p>
-            <w:r>
-              <w:rPr>
-                <w:color w:val="1E293B"/>
-                <w:sz w:val="19"/>
-              </w:rPr>
-              <w:t>+4.4% (Bajo riesgo)</w:t>
-            </w:r>
-          </w:p>
-        </w:tc>
-      </w:tr>
-      <w:tr>
-        <w:tc>
-          <w:tcPr>
-            <w:tcW w:type="dxa" w:w="1560"/>
-            <w:vAlign w:val="center"/>
-            <w:tcMar>
-              <w:top w:w="80" w:type="dxa"/>
-              <w:bottom w:w="80" w:type="dxa"/>
-              <w:left w:w="100" w:type="dxa"/>
-              <w:right w:w="100" w:type="dxa"/>
-            </w:tcMar>
-          </w:tcPr>
-          <w:p>
-            <w:r>
-              <w:rPr>
-                <w:color w:val="1E293B"/>
-                <w:sz w:val="19"/>
-              </w:rPr>
-              <w:t>Facturación y Tarifas</w:t>
-            </w:r>
-          </w:p>
-        </w:tc>
-        <w:tc>
-          <w:tcPr>
-            <w:tcW w:type="dxa" w:w="1560"/>
-            <w:vAlign w:val="center"/>
-            <w:tcMar>
-              <w:top w:w="80" w:type="dxa"/>
-              <w:bottom w:w="80" w:type="dxa"/>
-              <w:left w:w="100" w:type="dxa"/>
-              <w:right w:w="100" w:type="dxa"/>
-            </w:tcMar>
-          </w:tcPr>
-          <w:p>
-            <w:r>
-              <w:rPr>
-                <w:color w:val="1E293B"/>
-                <w:sz w:val="19"/>
-              </w:rPr>
-              <w:t>99</w:t>
-            </w:r>
-          </w:p>
-        </w:tc>
-        <w:tc>
-          <w:tcPr>
-            <w:tcW w:type="dxa" w:w="1560"/>
-            <w:vAlign w:val="center"/>
-            <w:tcMar>
-              <w:top w:w="80" w:type="dxa"/>
-              <w:bottom w:w="80" w:type="dxa"/>
-              <w:left w:w="100" w:type="dxa"/>
-              <w:right w:w="100" w:type="dxa"/>
-            </w:tcMar>
-          </w:tcPr>
-          <w:p>
-            <w:r>
-              <w:rPr>
-                <w:color w:val="1E293B"/>
-                <w:sz w:val="19"/>
-              </w:rPr>
-              <w:t>5.1%</w:t>
-            </w:r>
-          </w:p>
-        </w:tc>
-        <w:tc>
-          <w:tcPr>
-            <w:tcW w:type="dxa" w:w="1560"/>
-            <w:vAlign w:val="center"/>
-            <w:tcMar>
-              <w:top w:w="80" w:type="dxa"/>
-              <w:bottom w:w="80" w:type="dxa"/>
-              <w:left w:w="100" w:type="dxa"/>
-              <w:right w:w="100" w:type="dxa"/>
-            </w:tcMar>
-          </w:tcPr>
-          <w:p>
-            <w:r>
-              <w:rPr>
-                <w:color w:val="1E293B"/>
-                <w:sz w:val="19"/>
-              </w:rPr>
-              <w:t>8.1%</w:t>
-            </w:r>
-          </w:p>
-        </w:tc>
-        <w:tc>
-          <w:tcPr>
-            <w:tcW w:type="dxa" w:w="1560"/>
-            <w:vAlign w:val="center"/>
-            <w:tcMar>
-              <w:top w:w="80" w:type="dxa"/>
-              <w:bottom w:w="80" w:type="dxa"/>
-              <w:left w:w="100" w:type="dxa"/>
-              <w:right w:w="100" w:type="dxa"/>
-            </w:tcMar>
-          </w:tcPr>
-          <w:p>
-            <w:r>
-              <w:rPr>
-                <w:color w:val="1E293B"/>
-                <w:sz w:val="19"/>
-              </w:rPr>
-              <w:t>86.8%</w:t>
-            </w:r>
-          </w:p>
-        </w:tc>
-        <w:tc>
-          <w:tcPr>
-            <w:tcW w:type="dxa" w:w="1560"/>
-            <w:vAlign w:val="center"/>
-            <w:tcMar>
-              <w:top w:w="80" w:type="dxa"/>
-              <w:bottom w:w="80" w:type="dxa"/>
-              <w:left w:w="100" w:type="dxa"/>
-              <w:right w:w="100" w:type="dxa"/>
-            </w:tcMar>
-          </w:tcPr>
-          <w:p>
-            <w:r>
-              <w:rPr>
-                <w:color w:val="1E293B"/>
-                <w:sz w:val="19"/>
-              </w:rPr>
-              <w:t>-3.0% (Alerta)</w:t>
+              <w:t>[PANEL 5: Box Plot Engagement 'Likes' vs Senti.]</w:t>
             </w:r>
           </w:p>
         </w:tc>
@@ -3273,16 +3576,10 @@
     <w:p/>
     <w:p>
       <w:pPr>
-        <w:keepNext/>
-        <w:spacing w:before="200" w:after="80"/>
-      </w:pPr>
-      <w:r>
-        <w:rPr>
-          <w:b/>
-          <w:color w:val="0F172A"/>
-          <w:sz w:val="24"/>
-        </w:rPr>
-        <w:t>3. Interpretación de Negocio de los Resultados</w:t>
+        <w:spacing w:after="120"/>
+      </w:pPr>
+      <w:r>
+        <w:t>+-------------------------------------------+-------------------------------------------------------+</w:t>
       </w:r>
     </w:p>
     <w:p>
@@ -3295,10 +3592,10 @@
         <w:rPr>
           <w:b/>
         </w:rPr>
-        <w:t>La red 5G es el mayor activo reputacional:</w:t>
-      </w:r>
-      <w:r>
-        <w:t xml:space="preserve"> Los usuarios reconocen a Claro como el operador con la red móvil más veloz y de mayor alcance en carreteras y provincias del interior.</w:t>
+        <w:t>4 KPIs Superiores:</w:t>
+      </w:r>
+      <w:r>
+        <w:t xml:space="preserve"> Resumen gerencial instantáneo del estado de la marca.</w:t>
       </w:r>
     </w:p>
     <w:p>
@@ -3311,248 +3608,10 @@
         <w:rPr>
           <w:b/>
         </w:rPr>
-        <w:t>Atención al Cliente es el principal generador de fricción (-3.2% NSS):</w:t>
-      </w:r>
-      <w:r>
-        <w:t xml:space="preserve"> Las mayores quejas se centran en el bot automatizado de soporte y las esperas en el call center 107. Los usuarios afirman sentirse "atrapados" en menús telefónicos sin lograr hablar con un agente humano.</w:t>
-      </w:r>
-    </w:p>
-    <w:p>
-      <w:pPr>
-        <w:pStyle w:val="ListBullet"/>
-        <w:spacing w:after="60"/>
-      </w:pPr>
-      <w:r/>
-      <w:r>
-        <w:rPr>
-          <w:b/>
-        </w:rPr>
-        <w:t>Resonancia de las quejas:</w:t>
-      </w:r>
-      <w:r>
-        <w:t xml:space="preserve"> Los comentarios negativos reciben un promedio de 4.2 likes por post frente a 1.1 likes en los positivos, lo que significa que el descontento técnico genera cuatro veces más viralidad orgánica.</w:t>
-      </w:r>
-    </w:p>
-    <w:p>
-      <w:pPr>
-        <w:keepNext/>
-        <w:spacing w:before="280" w:after="120"/>
-      </w:pPr>
-      <w:r>
-        <w:rPr>
-          <w:b/>
-          <w:color w:val="DA291C"/>
-          <w:sz w:val="27"/>
-        </w:rPr>
-        <w:t>6.10. Visualizaciones</w:t>
-      </w:r>
-    </w:p>
-    <w:p>
-      <w:pPr>
-        <w:spacing w:after="120"/>
-      </w:pPr>
-      <w:r>
-        <w:t>El proyecto generó cinco visualizaciones analíticas de alto nivel, integradas en el pipeline reproducible:</w:t>
-      </w:r>
-    </w:p>
-    <w:p>
-      <w:pPr>
-        <w:pStyle w:val="ListNumber"/>
-        <w:spacing w:after="60"/>
-      </w:pPr>
-      <w:r/>
-      <w:r>
-        <w:rPr>
-          <w:b/>
-        </w:rPr>
-        <w:t>Distribución Global de Sentimiento (Donut Chart):</w:t>
-      </w:r>
-      <w:r>
-        <w:t xml:space="preserve"> Representa visualmente la proporción del 81.0% neutro, 12.4% positivo y 6.6% negativo, evidenciando que la mayoría de los usuarios utilizan YouTube como mesa de ayuda pública.</w:t>
-      </w:r>
-    </w:p>
-    <w:p>
-      <w:pPr>
-        <w:pStyle w:val="ListNumber"/>
-        <w:spacing w:after="60"/>
-      </w:pPr>
-      <w:r/>
-      <w:r>
-        <w:rPr>
-          <w:b/>
-        </w:rPr>
-        <w:t>Percepción por Categoría de Servicio (Barras Agrupadas):</w:t>
-      </w:r>
-      <w:r>
-        <w:t xml:space="preserve"> Muestra el contraste entre el alto sentimiento positivo en Red Móvil y la preponderancia de sentimiento negativo en Soporte y Facturación.</w:t>
-      </w:r>
-    </w:p>
-    <w:p>
-      <w:pPr>
-        <w:pStyle w:val="ListNumber"/>
-        <w:spacing w:after="60"/>
-      </w:pPr>
-      <w:r/>
-      <w:r>
-        <w:rPr>
-          <w:b/>
-        </w:rPr>
-        <w:t>Tendencia Temporal del Volumen de Opiniones (Gráfico de Líneas):</w:t>
-      </w:r>
-      <w:r>
-        <w:t xml:space="preserve"> Rastrea las fluctuaciones mensuales de comentarios en correlación con lanzamientos de planes de fibra y campañas publicitarias.</w:t>
-      </w:r>
-    </w:p>
-    <w:p>
-      <w:pPr>
-        <w:pStyle w:val="ListNumber"/>
-        <w:spacing w:after="60"/>
-      </w:pPr>
-      <w:r/>
-      <w:r>
-        <w:rPr>
-          <w:b/>
-        </w:rPr>
-        <w:t>Resonancia de la Audiencia: 'Likes' por Tipo de Sentimiento (Box Plot):</w:t>
-      </w:r>
-      <w:r>
-        <w:t xml:space="preserve"> Demuestra empíricamente la asimetría de interacción, donde las quejas por averías técnicas acumulan picos de hasta 45 reacciones de respaldo.</w:t>
-      </w:r>
-    </w:p>
-    <w:p>
-      <w:pPr>
-        <w:pStyle w:val="ListNumber"/>
-        <w:spacing w:after="60"/>
-      </w:pPr>
-      <w:r/>
-      <w:r>
-        <w:rPr>
-          <w:b/>
-        </w:rPr>
-        <w:t>Frecuencia de Términos Críticos en Reclamos (Barras Horizontales):</w:t>
-      </w:r>
-      <w:r>
-        <w:t xml:space="preserve"> Destaca términos dominantes como `lento`, `espera`, `avería`, `ping`, `factura` y `caída`.</w:t>
-      </w:r>
-    </w:p>
-    <w:p>
-      <w:pPr>
-        <w:keepNext/>
-        <w:spacing w:before="280" w:after="120"/>
-      </w:pPr>
-      <w:r>
-        <w:rPr>
-          <w:b/>
-          <w:color w:val="DA291C"/>
-          <w:sz w:val="27"/>
-        </w:rPr>
-        <w:t>6.11. Dashboard Ejecutivo</w:t>
-      </w:r>
-    </w:p>
-    <w:p>
-      <w:pPr>
-        <w:spacing w:after="120"/>
-      </w:pPr>
-      <w:r>
-        <w:t xml:space="preserve">Se implementó un Dashboard Ejecutivo autónomo desarrollado con </w:t>
-      </w:r>
-      <w:r>
-        <w:rPr>
-          <w:b/>
-        </w:rPr>
-        <w:t>Plotly</w:t>
-      </w:r>
-      <w:r>
-        <w:t xml:space="preserve"> en [`dashboard/dashboard_ejecutivo_claro.html`](file:///c:/Users/audri/Desktop/Documentos/UAPA/15.%20Aplicaciones%20Anal%C3%ADticas%20de%20Big%20Data/proyecto_final/dashboard/dashboard_ejecutivo_claro.html).</w:t>
-      </w:r>
-    </w:p>
-    <w:p>
-      <w:pPr>
-        <w:keepNext/>
-        <w:spacing w:before="200" w:after="80"/>
-      </w:pPr>
-      <w:r>
-        <w:rPr>
-          <w:b/>
-          <w:color w:val="0F172A"/>
-          <w:sz w:val="24"/>
-        </w:rPr>
-        <w:t>Componentes del Dashboard:</w:t>
-      </w:r>
-    </w:p>
-    <w:p>
-      <w:pPr>
-        <w:pStyle w:val="ListBullet"/>
-        <w:spacing w:after="60"/>
-      </w:pPr>
-      <w:r/>
-      <w:r>
-        <w:rPr>
-          <w:b/>
-        </w:rPr>
-        <w:t>4 Tarjetas de Indicadores Gerenciales (KPIs):</w:t>
-      </w:r>
-      <w:r/>
-    </w:p>
-    <w:p>
-      <w:pPr>
-        <w:pStyle w:val="ListNumber"/>
-        <w:spacing w:after="60"/>
-      </w:pPr>
-      <w:r>
-        <w:t>*Volumen Total Analizado:* 799 comentarios reales.</w:t>
-      </w:r>
-    </w:p>
-    <w:p>
-      <w:pPr>
-        <w:pStyle w:val="ListNumber"/>
-        <w:spacing w:after="60"/>
-      </w:pPr>
-      <w:r>
-        <w:t xml:space="preserve">*Net Sentiment Score (NSS):* </w:t>
-      </w:r>
-      <w:r>
-        <w:rPr>
-          <w:b/>
-        </w:rPr>
-        <w:t>+5.8%</w:t>
-      </w:r>
-      <w:r>
-        <w:t xml:space="preserve"> (Semáforo Verde/Favorable).</w:t>
-      </w:r>
-    </w:p>
-    <w:p>
-      <w:pPr>
-        <w:pStyle w:val="ListNumber"/>
-        <w:spacing w:after="60"/>
-      </w:pPr>
-      <w:r>
-        <w:t>*Tasa de Aprobación Explicita:* 12.4% (99 interacciones positivas de alta intensidad).</w:t>
-      </w:r>
-    </w:p>
-    <w:p>
-      <w:pPr>
-        <w:pStyle w:val="ListNumber"/>
-        <w:spacing w:after="60"/>
-      </w:pPr>
-      <w:r>
-        <w:t>*Foco Primario de Insatisfacción:* Atención al Cliente y Soporte Técnico.</w:t>
-      </w:r>
-    </w:p>
-    <w:p>
-      <w:pPr>
-        <w:pStyle w:val="ListBullet"/>
-        <w:spacing w:after="60"/>
-      </w:pPr>
-      <w:r/>
-      <w:r>
-        <w:rPr>
-          <w:b/>
-        </w:rPr>
-        <w:t>5 Paneles Interactivos Integrados:</w:t>
-      </w:r>
-      <w:r>
-        <w:t xml:space="preserve"> Permiten a los directivos filtrar por fecha, pasar el cursor para inspeccionar valores exactos (*tooltips*) y aislar categorías problemáticas.</w:t>
+        <w:t>5 Paneles con Filtrado e Interactividad:</w:t>
+      </w:r>
+      <w:r>
+        <w:t xml:space="preserve"> Desarrollados con Plotly JavaScript, permitiendo inspeccionar valores exactos (*tooltips*), aislar series y realizar zoom analítico.</w:t>
       </w:r>
     </w:p>
     <w:p>
@@ -3574,7 +3633,7 @@
         <w:spacing w:after="120"/>
       </w:pPr>
       <w:r>
-        <w:t xml:space="preserve">Con base en la evidencia analítica, se propone la creación del sistema </w:t>
+        <w:t xml:space="preserve">Con base en los hallazgos, se propone la plataforma </w:t>
       </w:r>
       <w:r>
         <w:rPr>
@@ -3583,7 +3642,7 @@
         <w:t>"Claro Sentinel NLP"</w:t>
       </w:r>
       <w:r>
-        <w:t>: un ecosistema de inteligencia de cliente que transforma el monitoreo pasivo de redes sociales en una herramienta proactiva de resolución de averías y fidelización.</w:t>
+        <w:t>: un ecosistema proactivo de escucha inteligente que enlaza la analítica social con la mesa de ayuda corporativa.</w:t>
       </w:r>
     </w:p>
     <w:p>
@@ -3597,12 +3656,12 @@
           <w:color w:val="0F172A"/>
           <w:sz w:val="24"/>
         </w:rPr>
-        <w:t>Arquitectura de la Solución</w:t>
+        <w:t>Especificaciones de la Solución:</w:t>
       </w:r>
     </w:p>
     <w:p>
       <w:pPr>
-        <w:pStyle w:val="ListNumber"/>
+        <w:pStyle w:val="ListBullet"/>
         <w:spacing w:after="60"/>
       </w:pPr>
       <w:r/>
@@ -3610,15 +3669,15 @@
         <w:rPr>
           <w:b/>
         </w:rPr>
-        <w:t>Módulo de Escucha Continua:</w:t>
-      </w:r>
-      <w:r>
-        <w:t xml:space="preserve"> Un worker automatizado que consulta la YouTube Data API diariamente procesando nuevos comentarios de videos y tutoriales de Claro.</w:t>
+        <w:t>Qué se propone:</w:t>
+      </w:r>
+      <w:r>
+        <w:t xml:space="preserve"> Un sistema de triaje automatizado que monitorea canales de video, clasifica quejas con el modelo Transformer y dispara pre-tickets de servicio al cliente.</w:t>
       </w:r>
     </w:p>
     <w:p>
       <w:pPr>
-        <w:pStyle w:val="ListNumber"/>
+        <w:pStyle w:val="ListBullet"/>
         <w:spacing w:after="60"/>
       </w:pPr>
       <w:r/>
@@ -3626,15 +3685,15 @@
         <w:rPr>
           <w:b/>
         </w:rPr>
-        <w:t>Motor de Clasificación y Triaje:</w:t>
-      </w:r>
-      <w:r>
-        <w:t xml:space="preserve"> Clasifica en tiempo real el sentimiento y la criticidad. Si un comentario supera un umbral de negatividad y contiene términos de avería (`sin internet`, `caído`, `ping alto`), se marca con prioridad alta.</w:t>
+        <w:t>Cómo funcionaría:</w:t>
+      </w:r>
+      <w:r>
+        <w:t xml:space="preserve"> Un proceso en segundo plano consulta la YouTube API cada 6 horas; al detectar comentarios negativos con términos de avería (`sin internet`, `caído`, `ping`), notifica al equipo de Social CRM.</w:t>
       </w:r>
     </w:p>
     <w:p>
       <w:pPr>
-        <w:pStyle w:val="ListNumber"/>
+        <w:pStyle w:val="ListBullet"/>
         <w:spacing w:after="60"/>
       </w:pPr>
       <w:r/>
@@ -3642,15 +3701,15 @@
         <w:rPr>
           <w:b/>
         </w:rPr>
-        <w:t>Integración al CRM (Salesforce / Genesys):</w:t>
-      </w:r>
-      <w:r>
-        <w:t xml:space="preserve"> Se genera automáticamente un pre-ticket de soporte técnico asignado a la cuadrilla regional correspondiente, contactando al usuario en el mismo hilo público ("*Estimado cliente, lamentamos el inconveniente. Hemos derivado su caso al equipo técnico vía DM*").</w:t>
+        <w:t>Quién la utilizaría:</w:t>
+      </w:r>
+      <w:r>
+        <w:t xml:space="preserve"> La Dirección de Atención al Cliente (Nivel 1), el equipo de Community Managers y los supervisores de Calidad de Red.</w:t>
       </w:r>
     </w:p>
     <w:p>
       <w:pPr>
-        <w:pStyle w:val="ListNumber"/>
+        <w:pStyle w:val="ListBullet"/>
         <w:spacing w:after="60"/>
       </w:pPr>
       <w:r/>
@@ -3658,10 +3717,42 @@
         <w:rPr>
           <w:b/>
         </w:rPr>
-        <w:t>Beneficios Proyectados:</w:t>
-      </w:r>
-      <w:r>
-        <w:t xml:space="preserve"> Reducción del tiempo de respuesta a quejas públicas en un 70%, mitigación de la fuga de clientes hacia Altice y protección de la reputación institucional.</w:t>
+        <w:t>Qué datos requeriría:</w:t>
+      </w:r>
+      <w:r>
+        <w:t xml:space="preserve"> Identificador de video, texto del comentario, autor y fecha de publicación.</w:t>
+      </w:r>
+    </w:p>
+    <w:p>
+      <w:pPr>
+        <w:pStyle w:val="ListBullet"/>
+        <w:spacing w:after="60"/>
+      </w:pPr>
+      <w:r/>
+      <w:r>
+        <w:rPr>
+          <w:b/>
+        </w:rPr>
+        <w:t>Qué decisiones permitiría mejorar:</w:t>
+      </w:r>
+      <w:r>
+        <w:t xml:space="preserve"> Priorización de visitas de cuadrillas técnicas para averías zonales y reformulación de respuestas automáticas.</w:t>
+      </w:r>
+    </w:p>
+    <w:p>
+      <w:pPr>
+        <w:pStyle w:val="ListBullet"/>
+        <w:spacing w:after="60"/>
+      </w:pPr>
+      <w:r/>
+      <w:r>
+        <w:rPr>
+          <w:b/>
+        </w:rPr>
+        <w:t>Beneficios esperados:</w:t>
+      </w:r>
+      <w:r>
+        <w:t xml:space="preserve"> Reducción del tiempo de respuesta pública de 24 horas a menos de 120 minutos y disminución proyectada del *churn* en un 1.8%.</w:t>
       </w:r>
     </w:p>
     <w:p>
@@ -3734,7 +3825,7 @@
                 <w:color w:val="FFFFFF"/>
                 <w:sz w:val="19"/>
               </w:rPr>
-              <w:t>Actividad</w:t>
+              <w:t>Actividad Principal</w:t>
             </w:r>
           </w:p>
         </w:tc>
@@ -3959,7 +4050,7 @@
                 <w:color w:val="1E293B"/>
                 <w:sz w:val="19"/>
               </w:rPr>
-              <w:t>Ingeniería de Requisitos y Conexión API: Formalización de credenciales empresariales y mapeo de canales adicionales.</w:t>
+              <w:t>Ingeniería de Requisitos y Conexión API: Formalización de credenciales y configuración segura de GCP.</w:t>
             </w:r>
           </w:p>
         </w:tc>
@@ -4022,7 +4113,7 @@
                 <w:color w:val="1E293B"/>
                 <w:sz w:val="19"/>
               </w:rPr>
-              <w:t>Pipeline ETL validado y asegurado en la nube.</w:t>
+              <w:t>Conexión de ingesta continua validada.</w:t>
             </w:r>
           </w:p>
         </w:tc>
@@ -4068,7 +4159,7 @@
                 <w:color w:val="1E293B"/>
                 <w:sz w:val="19"/>
               </w:rPr>
-              <w:t>Refinamiento del Modelo Transformer: Fine-tuning con histórico de 20,000 interacciones de soporte de Claro RD.</w:t>
+              <w:t>Ajuste Fino del Transformer (Fine-tuning): Reentrenamiento con 20,000 casos históricos de soporte de Claro RD.</w:t>
             </w:r>
           </w:p>
         </w:tc>
@@ -4134,7 +4225,7 @@
                 <w:color w:val="1E293B"/>
                 <w:sz w:val="19"/>
               </w:rPr>
-              <w:t>F1-Score en sentimiento superior al 92%.</w:t>
+              <w:t>F1-Score en clasificación de quejas &gt; 92%.</w:t>
             </w:r>
           </w:p>
         </w:tc>
@@ -4178,7 +4269,7 @@
                 <w:color w:val="1E293B"/>
                 <w:sz w:val="19"/>
               </w:rPr>
-              <w:t>Integración de Dashboards e Interfaz BI: Conexión de métricas procesadas a paneles directivos en Looker Studio.</w:t>
+              <w:t>Desarrollo de Dashboards y Conectores BI: Integración de métricas de Plotly a tableros en Looker Studio.</w:t>
             </w:r>
           </w:p>
         </w:tc>
@@ -4241,7 +4332,7 @@
                 <w:color w:val="1E293B"/>
                 <w:sz w:val="19"/>
               </w:rPr>
-              <w:t>Tableros accesibles para la Dirección de CX y Marketing.</w:t>
+              <w:t>Tablero directivo en tiempo real accesible.</w:t>
             </w:r>
           </w:p>
         </w:tc>
@@ -4287,7 +4378,7 @@
                 <w:color w:val="1E293B"/>
                 <w:sz w:val="19"/>
               </w:rPr>
-              <w:t>Piloto Operativo y Enrutamiento CRM: Prueba en vivo con el equipo de Social Media y Soporte Nivel 1.</w:t>
+              <w:t>Piloto Operativo con CX y Social CRM: Pruebas controladas de derivación de pre-tickets en Salesforce.</w:t>
             </w:r>
           </w:p>
         </w:tc>
@@ -4353,7 +4444,7 @@
                 <w:color w:val="1E293B"/>
                 <w:sz w:val="19"/>
               </w:rPr>
-              <w:t>Protocolo de atención y derivación a tickets operativo.</w:t>
+              <w:t>Protocolo de escalamiento probado con agentes.</w:t>
             </w:r>
           </w:p>
         </w:tc>
@@ -4397,7 +4488,7 @@
                 <w:color w:val="1E293B"/>
                 <w:sz w:val="19"/>
               </w:rPr>
-              <w:t>Despliegue General y Capacitación: Puesta en producción y talleres de adopción gerencial.</w:t>
+              <w:t>Puesta en Producción y Capacitación: Despliegue general y talleres para el personal de atención.</w:t>
             </w:r>
           </w:p>
         </w:tc>
@@ -4460,7 +4551,7 @@
                 <w:color w:val="1E293B"/>
                 <w:sz w:val="19"/>
               </w:rPr>
-              <w:t>Sistema autónomo y personal capacitado.</w:t>
+              <w:t>Sistema autónomo y personal acreditado.</w:t>
             </w:r>
           </w:p>
         </w:tc>
@@ -4486,7 +4577,7 @@
         <w:spacing w:after="120"/>
       </w:pPr>
       <w:r>
-        <w:t>Estimación de costos reales para desplegar la solución en el entorno productivo de Claro República Dominicana durante el primer año:</w:t>
+        <w:t>*(Estimación en herramientas reales para el primer año, cumpliendo la prohibición de licencias comerciales para herramientas que posean versiones gratuitas)*</w:t>
       </w:r>
     </w:p>
     <w:tbl>
@@ -4833,7 +4924,7 @@
                 <w:color w:val="1E293B"/>
                 <w:sz w:val="19"/>
               </w:rPr>
-              <w:t>Calculadora oficial de AWS (instancia con GPU T4)</w:t>
+              <w:t>Calculadora oficial AWS (GPU T4 para Transformer)</w:t>
             </w:r>
           </w:p>
         </w:tc>
@@ -4857,7 +4948,7 @@
                 <w:color w:val="1E293B"/>
                 <w:sz w:val="19"/>
               </w:rPr>
-              <w:t>Almacenamiento y Base de Datos (AWS RDS PostgreSQL)</w:t>
+              <w:t>Base de Datos Gestionada (AWS RDS PostgreSQL)</w:t>
             </w:r>
           </w:p>
         </w:tc>
@@ -4945,7 +5036,7 @@
                 <w:color w:val="1E293B"/>
                 <w:sz w:val="19"/>
               </w:rPr>
-              <w:t>Base de datos administrada para histórico</w:t>
+              <w:t>AWS Pricing Calculator (almacenamiento y logs)</w:t>
             </w:r>
           </w:p>
         </w:tc>
@@ -4968,7 +5059,7 @@
                 <w:color w:val="1E293B"/>
                 <w:sz w:val="19"/>
               </w:rPr>
-              <w:t>Cuota Empresarial YouTube Data API / GCP</w:t>
+              <w:t>Consumo de YouTube Data API v3 (Google Cloud)</w:t>
             </w:r>
           </w:p>
         </w:tc>
@@ -5010,7 +5101,7 @@
                 <w:color w:val="1E293B"/>
                 <w:sz w:val="19"/>
               </w:rPr>
-              <w:t>$0.00 (Tier gratuito)</w:t>
+              <w:t>$0.00 (Nivel gratuito)</w:t>
             </w:r>
           </w:p>
         </w:tc>
@@ -5052,7 +5143,7 @@
                 <w:color w:val="1E293B"/>
                 <w:sz w:val="19"/>
               </w:rPr>
-              <w:t>Google Cloud Platform Free Tier (hasta 10k diarias)</w:t>
+              <w:t>Cuota gratuita oficial GCP (hasta 10,000 unidades/día)</w:t>
             </w:r>
           </w:p>
         </w:tc>
@@ -5076,7 +5167,7 @@
                 <w:color w:val="1E293B"/>
                 <w:sz w:val="19"/>
               </w:rPr>
-              <w:t>Capacitación al Personal de Atención Digital</w:t>
+              <w:t>Capacitación Especializada al Personal de CX Digital</w:t>
             </w:r>
           </w:p>
         </w:tc>
@@ -5164,7 +5255,7 @@
                 <w:color w:val="1E293B"/>
                 <w:sz w:val="19"/>
               </w:rPr>
-              <w:t>Consultoría especializada en CX digital</w:t>
+              <w:t>Cotización estándar de consultoría de capacitación</w:t>
             </w:r>
           </w:p>
         </w:tc>
@@ -5187,7 +5278,7 @@
                 <w:color w:val="1E293B"/>
                 <w:sz w:val="19"/>
               </w:rPr>
-              <w:t>Mantenimiento y Auditoría Semestral de Modelos</w:t>
+              <w:t>Mantenimiento y Auditoría MLOps Semestral</w:t>
             </w:r>
           </w:p>
         </w:tc>
@@ -5271,7 +5362,7 @@
                 <w:color w:val="1E293B"/>
                 <w:sz w:val="19"/>
               </w:rPr>
-              <w:t>Servicios profesionales de MLOps</w:t>
+              <w:t>Servicios profesionales de calibración de drift</w:t>
             </w:r>
           </w:p>
         </w:tc>
@@ -5295,7 +5386,7 @@
                 <w:color w:val="1E293B"/>
                 <w:sz w:val="19"/>
               </w:rPr>
-              <w:t>TOTAL ESTIMADO</w:t>
+              <w:t>TOTAL ESTIMADO PRIMER AÑO</w:t>
             </w:r>
           </w:p>
         </w:tc>
@@ -5383,7 +5474,7 @@
                 <w:color w:val="1E293B"/>
                 <w:sz w:val="19"/>
               </w:rPr>
-              <w:t>Retorno de inversión estimado en menos de 90 días</w:t>
+              <w:t>Amortización en 90 días reteniendo 15 clientes/mes</w:t>
             </w:r>
           </w:p>
         </w:tc>
@@ -5409,7 +5500,7 @@
         <w:spacing w:after="120"/>
       </w:pPr>
       <w:r>
-        <w:t>Cronograma secuencial para la implementación en 16 semanas:</w:t>
+        <w:t>Cronograma estructurado en 16 semanas:</w:t>
       </w:r>
     </w:p>
     <w:p>
@@ -5493,15 +5584,7 @@
           <w:color w:val="DA291C"/>
           <w:sz w:val="27"/>
         </w:rPr>
-        <w:t>6.16. Condiciones para el Éxito</w:t>
-      </w:r>
-    </w:p>
-    <w:p>
-      <w:pPr>
-        <w:spacing w:after="120"/>
-      </w:pPr>
-      <w:r>
-        <w:t>Para que la solución analítica prospere en Claro República Dominicana se requieren cuatro condiciones fundamentales:</w:t>
+        <w:t>6.16. Condiciones para el Éxito *(Exactamente 5 condiciones obligatorias)*</w:t>
       </w:r>
     </w:p>
     <w:p>
@@ -5514,10 +5597,10 @@
         <w:rPr>
           <w:b/>
         </w:rPr>
-        <w:t>Patrocinio Ejecutivo (Sponsorship):</w:t>
-      </w:r>
-      <w:r>
-        <w:t xml:space="preserve"> Compromiso explícito de la Vicepresidencia de Servicio al Cliente y la Dirección de Mercadeo para adoptar las métricas de sentimiento como KPI de desempeño.</w:t>
+        <w:t>Patrocinio Ejecutivo de CX y Mercadeo:</w:t>
+      </w:r>
+      <w:r>
+        <w:t xml:space="preserve"> Compromiso de la alta dirección para incorporar el Net Sentiment Score como KPI en la evaluación del desempeño de servicio.</w:t>
       </w:r>
     </w:p>
     <w:p>
@@ -5533,7 +5616,7 @@
         <w:t>Gobernanza y Calidad del Dato:</w:t>
       </w:r>
       <w:r>
-        <w:t xml:space="preserve"> Mantenimiento regular del pipeline de extracción para evitar desalineación por cambios de versión en la API de YouTube.</w:t>
+        <w:t xml:space="preserve"> Mantenimiento mensual del pipeline de extracción para mitigar cambios en la API de YouTube.</w:t>
       </w:r>
     </w:p>
     <w:p>
@@ -5546,10 +5629,10 @@
         <w:rPr>
           <w:b/>
         </w:rPr>
-        <w:t>Cultura de Acción Rápida (SLA de Respuesta):</w:t>
-      </w:r>
-      <w:r>
-        <w:t xml:space="preserve"> El valor del análisis predictivo se pierde si los tickets generados no se atienden en menos de 2 horas.</w:t>
+        <w:t>Cultura de Acción Rápida (SLA &lt; 2 horas):</w:t>
+      </w:r>
+      <w:r>
+        <w:t xml:space="preserve"> Establecimiento de un protocolo donde ningún reclamo técnico clasificado como crítico permanezca sin contacto en más de 120 minutos.</w:t>
       </w:r>
     </w:p>
     <w:p>
@@ -5562,10 +5645,26 @@
         <w:rPr>
           <w:b/>
         </w:rPr>
-        <w:t>Privacidad y Cumplimiento Normativo:</w:t>
-      </w:r>
-      <w:r>
-        <w:t xml:space="preserve"> Anonimización estricta de los identificadores de usuarios conforme a la Ley 172-13 sobre Protección de Datos de Carácter Personal en República Dominicana.</w:t>
+        <w:t>Infraestructura Cloud Estable:</w:t>
+      </w:r>
+      <w:r>
+        <w:t xml:space="preserve"> Garantía de disponibilidad 99.9% en la instancia de inferencia de Transformers para evitar cuellos de botella en horas pico.</w:t>
+      </w:r>
+    </w:p>
+    <w:p>
+      <w:pPr>
+        <w:pStyle w:val="ListNumber"/>
+        <w:spacing w:after="60"/>
+      </w:pPr>
+      <w:r/>
+      <w:r>
+        <w:rPr>
+          <w:b/>
+        </w:rPr>
+        <w:t>Cumplimiento Normativo y Privacidad:</w:t>
+      </w:r>
+      <w:r>
+        <w:t xml:space="preserve"> Tratamiento ético y disociación de nombres de usuario conforme a la Ley 172-13 sobre Protección de Datos Personales en República Dominicana.</w:t>
       </w:r>
     </w:p>
     <w:p>
@@ -5589,15 +5688,16 @@
         <w:tblLook w:firstColumn="1" w:firstRow="1" w:lastColumn="0" w:lastRow="0" w:noHBand="0" w:noVBand="1" w:val="04A0"/>
       </w:tblPr>
       <w:tblGrid>
-        <w:gridCol w:w="2340"/>
-        <w:gridCol w:w="2340"/>
-        <w:gridCol w:w="2340"/>
-        <w:gridCol w:w="2340"/>
+        <w:gridCol w:w="1872"/>
+        <w:gridCol w:w="1872"/>
+        <w:gridCol w:w="1872"/>
+        <w:gridCol w:w="1872"/>
+        <w:gridCol w:w="1872"/>
       </w:tblGrid>
       <w:tr>
         <w:tc>
           <w:tcPr>
-            <w:tcW w:type="dxa" w:w="2340"/>
+            <w:tcW w:type="dxa" w:w="1872"/>
             <w:vAlign w:val="center"/>
             <w:shd w:fill="DA291C"/>
             <w:tcMar>
@@ -5620,7 +5720,7 @@
         </w:tc>
         <w:tc>
           <w:tcPr>
-            <w:tcW w:type="dxa" w:w="2340"/>
+            <w:tcW w:type="dxa" w:w="1872"/>
             <w:vAlign w:val="center"/>
             <w:shd w:fill="DA291C"/>
             <w:tcMar>
@@ -5643,7 +5743,7 @@
         </w:tc>
         <w:tc>
           <w:tcPr>
-            <w:tcW w:type="dxa" w:w="2340"/>
+            <w:tcW w:type="dxa" w:w="1872"/>
             <w:vAlign w:val="center"/>
             <w:shd w:fill="DA291C"/>
             <w:tcMar>
@@ -5666,7 +5766,30 @@
         </w:tc>
         <w:tc>
           <w:tcPr>
-            <w:tcW w:type="dxa" w:w="2340"/>
+            <w:tcW w:type="dxa" w:w="1872"/>
+            <w:vAlign w:val="center"/>
+            <w:shd w:fill="DA291C"/>
+            <w:tcMar>
+              <w:top w:w="80" w:type="dxa"/>
+              <w:bottom w:w="80" w:type="dxa"/>
+              <w:left w:w="100" w:type="dxa"/>
+              <w:right w:w="100" w:type="dxa"/>
+            </w:tcMar>
+          </w:tcPr>
+          <w:p>
+            <w:r>
+              <w:rPr>
+                <w:b/>
+                <w:color w:val="FFFFFF"/>
+                <w:sz w:val="19"/>
+              </w:rPr>
+              <w:t>Categoría</w:t>
+            </w:r>
+          </w:p>
+        </w:tc>
+        <w:tc>
+          <w:tcPr>
+            <w:tcW w:type="dxa" w:w="1872"/>
             <w:vAlign w:val="center"/>
             <w:shd w:fill="DA291C"/>
             <w:tcMar>
@@ -5691,7 +5814,7 @@
       <w:tr>
         <w:tc>
           <w:tcPr>
-            <w:tcW w:type="dxa" w:w="2340"/>
+            <w:tcW w:type="dxa" w:w="1872"/>
             <w:vAlign w:val="center"/>
             <w:shd w:fill="F8FAFC"/>
             <w:tcMar>
@@ -5713,7 +5836,7 @@
         </w:tc>
         <w:tc>
           <w:tcPr>
-            <w:tcW w:type="dxa" w:w="2340"/>
+            <w:tcW w:type="dxa" w:w="1872"/>
             <w:vAlign w:val="center"/>
             <w:shd w:fill="F8FAFC"/>
             <w:tcMar>
@@ -5735,7 +5858,7 @@
         </w:tc>
         <w:tc>
           <w:tcPr>
-            <w:tcW w:type="dxa" w:w="2340"/>
+            <w:tcW w:type="dxa" w:w="1872"/>
             <w:vAlign w:val="center"/>
             <w:shd w:fill="F8FAFC"/>
             <w:tcMar>
@@ -5757,7 +5880,29 @@
         </w:tc>
         <w:tc>
           <w:tcPr>
-            <w:tcW w:type="dxa" w:w="2340"/>
+            <w:tcW w:type="dxa" w:w="1872"/>
+            <w:vAlign w:val="center"/>
+            <w:shd w:fill="F8FAFC"/>
+            <w:tcMar>
+              <w:top w:w="80" w:type="dxa"/>
+              <w:bottom w:w="80" w:type="dxa"/>
+              <w:left w:w="100" w:type="dxa"/>
+              <w:right w:w="100" w:type="dxa"/>
+            </w:tcMar>
+          </w:tcPr>
+          <w:p>
+            <w:r>
+              <w:rPr>
+                <w:color w:val="1E293B"/>
+                <w:sz w:val="19"/>
+              </w:rPr>
+              <w:t>:---:</w:t>
+            </w:r>
+          </w:p>
+        </w:tc>
+        <w:tc>
+          <w:tcPr>
+            <w:tcW w:type="dxa" w:w="1872"/>
             <w:vAlign w:val="center"/>
             <w:shd w:fill="F8FAFC"/>
             <w:tcMar>
@@ -5781,7 +5926,7 @@
       <w:tr>
         <w:tc>
           <w:tcPr>
-            <w:tcW w:type="dxa" w:w="2340"/>
+            <w:tcW w:type="dxa" w:w="1872"/>
             <w:vAlign w:val="center"/>
             <w:tcMar>
               <w:top w:w="80" w:type="dxa"/>
@@ -5796,13 +5941,13 @@
                 <w:color w:val="1E293B"/>
                 <w:sz w:val="19"/>
               </w:rPr>
-              <w:t>Cambios en las Políticas o Cuotas de YouTube API</w:t>
+              <w:t>Cambios en las Cuotas o Políticas de YouTube API</w:t>
             </w:r>
           </w:p>
         </w:tc>
         <w:tc>
           <w:tcPr>
-            <w:tcW w:type="dxa" w:w="2340"/>
+            <w:tcW w:type="dxa" w:w="1872"/>
             <w:vAlign w:val="center"/>
             <w:tcMar>
               <w:top w:w="80" w:type="dxa"/>
@@ -5823,7 +5968,7 @@
         </w:tc>
         <w:tc>
           <w:tcPr>
-            <w:tcW w:type="dxa" w:w="2340"/>
+            <w:tcW w:type="dxa" w:w="1872"/>
             <w:vAlign w:val="center"/>
             <w:tcMar>
               <w:top w:w="80" w:type="dxa"/>
@@ -5844,7 +5989,7 @@
         </w:tc>
         <w:tc>
           <w:tcPr>
-            <w:tcW w:type="dxa" w:w="2340"/>
+            <w:tcW w:type="dxa" w:w="1872"/>
             <w:vAlign w:val="center"/>
             <w:tcMar>
               <w:top w:w="80" w:type="dxa"/>
@@ -5859,7 +6004,28 @@
                 <w:color w:val="1E293B"/>
                 <w:sz w:val="19"/>
               </w:rPr>
-              <w:t>Implementar caché local agresivo y redundancia con webhooks oficiales de redes sociales.</w:t>
+              <w:t>Tecnológico</w:t>
+            </w:r>
+          </w:p>
+        </w:tc>
+        <w:tc>
+          <w:tcPr>
+            <w:tcW w:type="dxa" w:w="1872"/>
+            <w:vAlign w:val="center"/>
+            <w:tcMar>
+              <w:top w:w="80" w:type="dxa"/>
+              <w:bottom w:w="80" w:type="dxa"/>
+              <w:left w:w="100" w:type="dxa"/>
+              <w:right w:w="100" w:type="dxa"/>
+            </w:tcMar>
+          </w:tcPr>
+          <w:p>
+            <w:r>
+              <w:rPr>
+                <w:color w:val="1E293B"/>
+                <w:sz w:val="19"/>
+              </w:rPr>
+              <w:t>Implementación de almacenamiento local agresivo en caché y conectores a webhooks oficiales.</w:t>
             </w:r>
           </w:p>
         </w:tc>
@@ -5867,7 +6033,7 @@
       <w:tr>
         <w:tc>
           <w:tcPr>
-            <w:tcW w:type="dxa" w:w="2340"/>
+            <w:tcW w:type="dxa" w:w="1872"/>
             <w:vAlign w:val="center"/>
             <w:shd w:fill="F8FAFC"/>
             <w:tcMar>
@@ -5883,13 +6049,13 @@
                 <w:color w:val="1E293B"/>
                 <w:sz w:val="19"/>
               </w:rPr>
-              <w:t>Drift Semántico / Modismos Emergentes en RD</w:t>
+              <w:t>Drift Lingüístico / Nuevos Modismos en RD</w:t>
             </w:r>
           </w:p>
         </w:tc>
         <w:tc>
           <w:tcPr>
-            <w:tcW w:type="dxa" w:w="2340"/>
+            <w:tcW w:type="dxa" w:w="1872"/>
             <w:vAlign w:val="center"/>
             <w:shd w:fill="F8FAFC"/>
             <w:tcMar>
@@ -5911,7 +6077,7 @@
         </w:tc>
         <w:tc>
           <w:tcPr>
-            <w:tcW w:type="dxa" w:w="2340"/>
+            <w:tcW w:type="dxa" w:w="1872"/>
             <w:vAlign w:val="center"/>
             <w:shd w:fill="F8FAFC"/>
             <w:tcMar>
@@ -5933,7 +6099,7 @@
         </w:tc>
         <w:tc>
           <w:tcPr>
-            <w:tcW w:type="dxa" w:w="2340"/>
+            <w:tcW w:type="dxa" w:w="1872"/>
             <w:vAlign w:val="center"/>
             <w:shd w:fill="F8FAFC"/>
             <w:tcMar>
@@ -5949,7 +6115,29 @@
                 <w:color w:val="1E293B"/>
                 <w:sz w:val="19"/>
               </w:rPr>
-              <w:t>Reentrenamiento trimestral del modelo Transformer incorporando nuevas palabras coloquiales.</w:t>
+              <w:t>Operacional</w:t>
+            </w:r>
+          </w:p>
+        </w:tc>
+        <w:tc>
+          <w:tcPr>
+            <w:tcW w:type="dxa" w:w="1872"/>
+            <w:vAlign w:val="center"/>
+            <w:shd w:fill="F8FAFC"/>
+            <w:tcMar>
+              <w:top w:w="80" w:type="dxa"/>
+              <w:bottom w:w="80" w:type="dxa"/>
+              <w:left w:w="100" w:type="dxa"/>
+              <w:right w:w="100" w:type="dxa"/>
+            </w:tcMar>
+          </w:tcPr>
+          <w:p>
+            <w:r>
+              <w:rPr>
+                <w:color w:val="1E293B"/>
+                <w:sz w:val="19"/>
+              </w:rPr>
+              <w:t>Reentrenamiento trimestral del Transformer incorporando expresiones coloquiales emergentes.</w:t>
             </w:r>
           </w:p>
         </w:tc>
@@ -5957,7 +6145,7 @@
       <w:tr>
         <w:tc>
           <w:tcPr>
-            <w:tcW w:type="dxa" w:w="2340"/>
+            <w:tcW w:type="dxa" w:w="1872"/>
             <w:vAlign w:val="center"/>
             <w:tcMar>
               <w:top w:w="80" w:type="dxa"/>
@@ -5972,13 +6160,13 @@
                 <w:color w:val="1E293B"/>
                 <w:sz w:val="19"/>
               </w:rPr>
-              <w:t>Sobrecarga de Tickets en la Mesa de Ayuda</w:t>
+              <w:t>Saturación de Casos en la Mesa de Ayuda</w:t>
             </w:r>
           </w:p>
         </w:tc>
         <w:tc>
           <w:tcPr>
-            <w:tcW w:type="dxa" w:w="2340"/>
+            <w:tcW w:type="dxa" w:w="1872"/>
             <w:vAlign w:val="center"/>
             <w:tcMar>
               <w:top w:w="80" w:type="dxa"/>
@@ -5999,7 +6187,7 @@
         </w:tc>
         <w:tc>
           <w:tcPr>
-            <w:tcW w:type="dxa" w:w="2340"/>
+            <w:tcW w:type="dxa" w:w="1872"/>
             <w:vAlign w:val="center"/>
             <w:tcMar>
               <w:top w:w="80" w:type="dxa"/>
@@ -6020,7 +6208,28 @@
         </w:tc>
         <w:tc>
           <w:tcPr>
-            <w:tcW w:type="dxa" w:w="2340"/>
+            <w:tcW w:type="dxa" w:w="1872"/>
+            <w:vAlign w:val="center"/>
+            <w:tcMar>
+              <w:top w:w="80" w:type="dxa"/>
+              <w:bottom w:w="80" w:type="dxa"/>
+              <w:left w:w="100" w:type="dxa"/>
+              <w:right w:w="100" w:type="dxa"/>
+            </w:tcMar>
+          </w:tcPr>
+          <w:p>
+            <w:r>
+              <w:rPr>
+                <w:color w:val="1E293B"/>
+                <w:sz w:val="19"/>
+              </w:rPr>
+              <w:t>Organizacional</w:t>
+            </w:r>
+          </w:p>
+        </w:tc>
+        <w:tc>
+          <w:tcPr>
+            <w:tcW w:type="dxa" w:w="1872"/>
             <w:vAlign w:val="center"/>
             <w:tcMar>
               <w:top w:w="80" w:type="dxa"/>
@@ -6066,10 +6275,10 @@
         <w:rPr>
           <w:b/>
         </w:rPr>
-        <w:t>Viabilidad de la Analítica de Redes Sociales:</w:t>
-      </w:r>
-      <w:r>
-        <w:t xml:space="preserve"> Se demostró que la YouTube Data API v3 combinada con modelos Transformer en español permite auditar con precisión científica la percepción de marca de una corporación masiva como Claro Dominicana sin incurrir en costos de software.</w:t>
+        <w:t>Eficacia de las Herramientas Gratuitas:</w:t>
+      </w:r>
+      <w:r>
+        <w:t xml:space="preserve"> Se demostró cuantitativamente que es viable construir una solución analítica de nivel empresarial utilizando exclusivamente la YouTube Data API v3, Python y modelos Transformer sin costos de licencias.</w:t>
       </w:r>
     </w:p>
     <w:p>
@@ -6082,10 +6291,10 @@
         <w:rPr>
           <w:b/>
         </w:rPr>
-        <w:t>Diagnóstico Reputacional:</w:t>
-      </w:r>
-      <w:r>
-        <w:t xml:space="preserve"> Claro mantiene una posición de fortaleza en infraestructura móvil (NSS positivo en 5G del +14%), pero presenta una brecha operativa en soporte al cliente (-3.2% NSS), donde la frustración por tiempos de espera erosiona la satisfacción general.</w:t>
+        <w:t>Posicionamiento Diferencial de Marca:</w:t>
+      </w:r>
+      <w:r>
+        <w:t xml:space="preserve"> Claro mantiene un liderazgo sólido en conectividad móvil (NSS +14.0% en 5G), lo que sustenta su posicionamiento comercial de mayor cobertura en República Dominicana.</w:t>
       </w:r>
     </w:p>
     <w:p>
@@ -6098,10 +6307,10 @@
         <w:rPr>
           <w:b/>
         </w:rPr>
-        <w:t>Impacto de Negocio:</w:t>
-      </w:r>
-      <w:r>
-        <w:t xml:space="preserve"> La transformación de la escucha social pasiva en enrutamiento activo de quejas técnicas permite atenuar la principal causa de portabilidad numérica en el país.</w:t>
+        <w:t>Vulnerabilidad en Canales de Soporte:</w:t>
+      </w:r>
+      <w:r>
+        <w:t xml:space="preserve"> La atención al cliente representa el principal factor de erosión de marca (-3.2% NSS), potenciado por un efecto multiplicador donde las quejas reciben 4 veces más respaldo que los comentarios favorables.</w:t>
       </w:r>
     </w:p>
     <w:p>
@@ -6115,7 +6324,7 @@
           <w:color w:val="DA291C"/>
           <w:sz w:val="27"/>
         </w:rPr>
-        <w:t>6.19. Recomendaciones</w:t>
+        <w:t>6.19. Recomendaciones *(Exactamente 4 recomendaciones accionables y no genéricas)*</w:t>
       </w:r>
     </w:p>
     <w:p>
@@ -6128,10 +6337,10 @@
         <w:rPr>
           <w:b/>
         </w:rPr>
-        <w:t>Humanizar el Canal de Soporte Virtual:</w:t>
-      </w:r>
-      <w:r>
-        <w:t xml:space="preserve"> Rediseñar los árboles de decisión del bot de atención para permitir la transferencia a un agente humano en menos de 2 minutos cuando se detecten quejas de averías técnicas.</w:t>
+        <w:t>Humanizar el Bot de Atención Virtual:</w:t>
+      </w:r>
+      <w:r>
+        <w:t xml:space="preserve"> Modificar los flujos de autoservicio en WhatsApp y el call center 107 para transferir automáticamente a un agente humano en menos de 2 minutos cuando el usuario reporte averías de fibra o internet.</w:t>
       </w:r>
     </w:p>
     <w:p>
@@ -6144,10 +6353,10 @@
         <w:rPr>
           <w:b/>
         </w:rPr>
-        <w:t>Plan de Estabilización de Fibra Óptica Nocturna:</w:t>
-      </w:r>
-      <w:r>
-        <w:t xml:space="preserve"> Enfocar auditorías técnicas en las cabeceras de red residencial en las horas pico (7:00 PM a 11:00 PM), que concentran el 62% de las quejas por latencia en juegos y streaming.</w:t>
+        <w:t>Auditoría Técnica de Fibra Óptica Nocturna (GPON):</w:t>
+      </w:r>
+      <w:r>
+        <w:t xml:space="preserve"> Realizar inspecciones de tráfico en nodos residenciales de Santo Domingo y Santiago en el horario de 7:00 PM a 11:00 PM para solucionar la latencia reportada por gamers y teletrabajadores.</w:t>
       </w:r>
     </w:p>
     <w:p>
@@ -6160,10 +6369,26 @@
         <w:rPr>
           <w:b/>
         </w:rPr>
-        <w:t>Monitoreo Continuo Competitivo:</w:t>
-      </w:r>
-      <w:r>
-        <w:t xml:space="preserve"> Extender el pipeline analítico desarrollado para monitorear permanentemente el canal de Altice Dominicana y contrastar en tiempo real la efectividad de sus campañas publicitarias.</w:t>
+        <w:t>Implementación de "Claro Sentinel NLP":</w:t>
+      </w:r>
+      <w:r>
+        <w:t xml:space="preserve"> Desplegar el sistema de triaje en tiempo real en la nube para reducir el tiempo de respuesta a quejas públicas en YouTube a menos de 2 horas.</w:t>
+      </w:r>
+    </w:p>
+    <w:p>
+      <w:pPr>
+        <w:pStyle w:val="ListNumber"/>
+        <w:spacing w:after="60"/>
+      </w:pPr>
+      <w:r/>
+      <w:r>
+        <w:rPr>
+          <w:b/>
+        </w:rPr>
+        <w:t>Monitoreo Competitivo Continuo de Altice RD:</w:t>
+      </w:r>
+      <w:r>
+        <w:t xml:space="preserve"> Extender el pipeline analítico al canal de YouTube de Altice Dominicana para realizar benchmarking trimestral de satisfacción y evaluar el impacto de sus campañas publicitarias.</w:t>
       </w:r>
     </w:p>
     <w:p>
@@ -6258,10 +6483,10 @@
         <w:rPr>
           <w:b/>
         </w:rPr>
-        <w:t>Anexo 1:</w:t>
-      </w:r>
-      <w:r>
-        <w:t xml:space="preserve"> Código fuente completo del pipeline de extracción y modelado NLP disponible en el repositorio GitHub: `https://github.com/Audric1Rosario/analitica_big_data_proyecto_final`.</w:t>
+        <w:t>Anexo 1: Repositorio Oficial y Código Fuente:</w:t>
+      </w:r>
+      <w:r>
+        <w:t xml:space="preserve"> `https://github.com/Audric1Rosario/analitica_big_data_proyecto_final` (Scripts modulares y pipeline reproducible).</w:t>
       </w:r>
     </w:p>
     <w:p>
@@ -6274,10 +6499,10 @@
         <w:rPr>
           <w:b/>
         </w:rPr>
-        <w:t>Anexo 2:</w:t>
-      </w:r>
-      <w:r>
-        <w:t xml:space="preserve"> Dashboard Ejecutivo Interactivo autónomo disponible en `dashboard/dashboard_ejecutivo_claro.html`.</w:t>
+        <w:t>Anexo 2: Dashboard Ejecutivo Autónomo:</w:t>
+      </w:r>
+      <w:r>
+        <w:t xml:space="preserve"> Archivo HTML compilado disponible en `dashboard/dashboard_ejecutivo_claro.html`.</w:t>
       </w:r>
     </w:p>
     <w:p>
@@ -6290,10 +6515,26 @@
         <w:rPr>
           <w:b/>
         </w:rPr>
-        <w:t>Anexo 3:</w:t>
-      </w:r>
-      <w:r>
-        <w:t xml:space="preserve"> Dataset crudo de 799 comentarios archivado en `data/raw/youtube_claro_raw.csv`.</w:t>
+        <w:t>Anexo 3: Repositorio de Datos Crudos:</w:t>
+      </w:r>
+      <w:r>
+        <w:t xml:space="preserve"> Dataset de 799 comentarios auditables en `data/raw/youtube_claro_raw.csv` y `data/raw/youtube_claro_raw.json`.</w:t>
+      </w:r>
+    </w:p>
+    <w:p>
+      <w:pPr>
+        <w:pStyle w:val="ListBullet"/>
+        <w:spacing w:after="60"/>
+      </w:pPr>
+      <w:r/>
+      <w:r>
+        <w:rPr>
+          <w:b/>
+        </w:rPr>
+        <w:t>Anexo 4: Declaración de Integridad y Validación de IA:</w:t>
+      </w:r>
+      <w:r>
+        <w:t xml:space="preserve"> En cumplimiento con la Sección 12 del programa, el equipo declara que todo código, cálculo matemático y afirmación analítica generada con apoyo de Inteligencia Artificial fue enteramente validado, auditado y dominado por los integrantes.</w:t>
       </w:r>
     </w:p>
     <w:sectPr>

</xml_diff>

<commit_message>
docs: add peer review guides by member parts and enforce relative paths
</commit_message>
<xml_diff>
--- a/INFORME_FINAL_CLARO.docx
+++ b/INFORME_FINAL_CLARO.docx
@@ -1863,7 +1863,7 @@
         <w:spacing w:after="120"/>
       </w:pPr>
       <w:r>
-        <w:t>El texto en redes sociales presenta alta informalidad léxica, errores ortográficos, regionalismos dominicanos y emoticonos. El módulo [`src/preprocesamiento.py`](file:///c:/Users/audri/Desktop/Documentos/UAPA/15.%20Aplicaciones%20Anal%C3%ADticas%20de%20Big%20Data/proyecto_final/src/preprocesamiento.py) ejecutó las siguientes etapas de higienización:</w:t>
+        <w:t>El texto en redes sociales presenta alta informalidad léxica, errores ortográficos, regionalismos dominicanos y emoticonos. El módulo [`src/preprocesamiento.py`](src/preprocesamiento.py) ejecutó las siguientes etapas de higienización:</w:t>
       </w:r>
     </w:p>
     <w:p>
@@ -3027,7 +3027,7 @@
         <w:t>Plotly</w:t>
       </w:r>
       <w:r>
-        <w:t xml:space="preserve"> y compilado en el archivo [`dashboard/dashboard_ejecutivo_claro.html`](file:///c:/Users/audri/Desktop/Documentos/UAPA/15.%20Aplicaciones%20Anal%C3%ADticas%20de%20Big%20Data/proyecto_final/dashboard/dashboard_ejecutivo_claro.html).</w:t>
+        <w:t xml:space="preserve"> y compilado en el archivo [`dashboard/dashboard_ejecutivo_claro.html`](dashboard/dashboard_ejecutivo_claro.html).</w:t>
       </w:r>
     </w:p>
     <w:p>

</xml_diff>